<commit_message>
Update handwritten guide with specific switch models and OSPF area labels
</commit_message>
<xml_diff>
--- a/Handwritten Assignment Guide.docx
+++ b/Handwritten Assignment Guide.docx
@@ -223,7 +223,7 @@
           <w:sz w:val="24"/>
           <w:szCs w:val="24"/>
         </w:rPr>
-        <w:t xml:space="preserve">Hierarchical Three-Tier Model:</w:t>
+        <w:t xml:space="preserve">Hierarchical Three-Tier Model &amp; Switch Models:</w:t>
       </w:r>
     </w:p>
     <w:p>
@@ -240,7 +240,73 @@
           <w:sz w:val="22"/>
           <w:szCs w:val="22"/>
         </w:rPr>
-        <w:t xml:space="preserve">The design leverages Cisco's hierarchical three-tier framework (Access, Distribution, and Core) to replace collapsible core environments. The Access Layer provides physical device connectivity, Power-over-Ethernet, and initial QoS marking. The Distribution Layer isolates broadcast domains, enforces policy maps, and functions as default gateways. The Core Layer represents the ultra-fast routing backplane, strictly using hardware-accelerated dynamic IP forwarding.</w:t>
+        <w:t xml:space="preserve">The design leverages Cisco's hierarchical three-tier framework (Access, Distribution, and Core) to replace collapsible core environments. Each tier is mapped to specific enterprise hardware models to meet capacity demands:</w:t>
+      </w:r>
+    </w:p>
+    <w:p>
+      <w:pPr>
+        <w:pStyle w:val="ListParagraph"/>
+        <w:numPr>
+          <w:ilvl w:val="0"/>
+          <w:numId w:val="1"/>
+        </w:numPr>
+        <w:spacing w:after="120" w:before="0" w:line="276"/>
+        <w:jc w:val="left"/>
+      </w:pPr>
+      <w:r>
+        <w:rPr>
+          <w:rFonts w:ascii="Arial" w:cs="Arial" w:eastAsia="Arial" w:hAnsi="Arial"/>
+          <w:b w:val="false"/>
+          <w:bCs w:val="false"/>
+          <w:color w:val="333333"/>
+          <w:sz w:val="22"/>
+          <w:szCs w:val="22"/>
+        </w:rPr>
+        <w:t xml:space="preserve">Access Layer: Provides physical connection endpoints for users, APs, and IoT. Operates at Layer 2 and initiates QoS marking. (Cisco Catalyst 9300 Series switches)</w:t>
+      </w:r>
+    </w:p>
+    <w:p>
+      <w:pPr>
+        <w:pStyle w:val="ListParagraph"/>
+        <w:numPr>
+          <w:ilvl w:val="0"/>
+          <w:numId w:val="1"/>
+        </w:numPr>
+        <w:spacing w:after="120" w:before="0" w:line="276"/>
+        <w:jc w:val="left"/>
+      </w:pPr>
+      <w:r>
+        <w:rPr>
+          <w:rFonts w:ascii="Arial" w:cs="Arial" w:eastAsia="Arial" w:hAnsi="Arial"/>
+          <w:b w:val="false"/>
+          <w:bCs w:val="false"/>
+          <w:color w:val="333333"/>
+          <w:sz w:val="22"/>
+          <w:szCs w:val="22"/>
+        </w:rPr>
+        <w:t xml:space="preserve">Distribution Layer: Aggregates access switches, acts as the Layer 2/3 boundary (default gateways via HSRP), and filters traffic. (Cisco Catalyst 9300 or 9500 Series switches)</w:t>
+      </w:r>
+    </w:p>
+    <w:p>
+      <w:pPr>
+        <w:pStyle w:val="ListParagraph"/>
+        <w:numPr>
+          <w:ilvl w:val="0"/>
+          <w:numId w:val="1"/>
+        </w:numPr>
+        <w:spacing w:after="120" w:before="0" w:line="276"/>
+        <w:jc w:val="left"/>
+      </w:pPr>
+      <w:r>
+        <w:rPr>
+          <w:rFonts w:ascii="Arial" w:cs="Arial" w:eastAsia="Arial" w:hAnsi="Arial"/>
+          <w:b w:val="false"/>
+          <w:bCs w:val="false"/>
+          <w:color w:val="333333"/>
+          <w:sz w:val="22"/>
+          <w:szCs w:val="22"/>
+        </w:rPr>
+        <w:t xml:space="preserve">Core Layer: The high-speed backbone. Focuses strictly on fast IP forwarding. Operating at Layer 3, it links distribution switches and edge routers. (Cisco Catalyst 9500 Series switches)</w:t>
       </w:r>
     </w:p>
     <w:p>
@@ -479,7 +545,7 @@
                 <w:sz w:val="18"/>
                 <w:szCs w:val="18"/>
               </w:rPr>
-              <w:t xml:space="preserve">        |    CORE-SW-A     |======|    CORE-SW-B     | (OSPF Area 0 - Backbone)</w:t>
+              <w:t xml:space="preserve">        |    CORE-SW-A     |======|    CORE-SW-B     | (OSPF Area 0 - Backbone: Catalyst 9500)</w:t>
             </w:r>
           </w:p>
           <w:p>
@@ -563,7 +629,7 @@
                 <w:sz w:val="18"/>
                 <w:szCs w:val="18"/>
               </w:rPr>
-              <w:t xml:space="preserve">|   ACAD-DIST   |         |  HOSTEL-DIST  |         | LIBADMIN-DIST | (MDF Dist. Switches)</w:t>
+              <w:t xml:space="preserve">|   ACAD-DIST   |         |  HOSTEL-DIST  |         | LIBADMIN-DIST | (MDF Catalyst 9500)</w:t>
             </w:r>
           </w:p>
           <w:p>
@@ -633,7 +699,7 @@
                 <w:sz w:val="18"/>
                 <w:szCs w:val="18"/>
               </w:rPr>
-              <w:t xml:space="preserve">|  Access Stacks|         |  Access Stacks|         |  Access Stacks| (IDF Access Switches)</w:t>
+              <w:t xml:space="preserve">|  Access Stacks|         |  Access Stacks|         |  Access Stacks| (IDF Catalyst 9300)</w:t>
             </w:r>
           </w:p>
           <w:p>
@@ -667,6 +733,250 @@
         </w:tc>
       </w:tr>
     </w:tbl>
+    <w:p>
+      <w:pPr>
+        <w:spacing w:after="90" w:before="180" w:line="276"/>
+        <w:jc w:val="left"/>
+      </w:pPr>
+      <w:r>
+        <w:rPr>
+          <w:rFonts w:ascii="Arial" w:cs="Arial" w:eastAsia="Arial" w:hAnsi="Arial"/>
+          <w:b/>
+          <w:bCs/>
+          <w:color w:val="2E5B82"/>
+          <w:sz w:val="24"/>
+          <w:szCs w:val="24"/>
+        </w:rPr>
+        <w:t xml:space="preserve">Diagram Execution &amp; OSPF Area Labeling:</w:t>
+      </w:r>
+    </w:p>
+    <w:p>
+      <w:pPr>
+        <w:spacing w:after="120" w:before="0" w:line="276"/>
+        <w:jc w:val="left"/>
+      </w:pPr>
+      <w:r>
+        <w:rPr>
+          <w:rFonts w:ascii="Arial" w:cs="Arial" w:eastAsia="Arial" w:hAnsi="Arial"/>
+          <w:b/>
+          <w:bCs/>
+          <w:color w:val="333333"/>
+          <w:sz w:val="22"/>
+          <w:szCs w:val="22"/>
+        </w:rPr>
+        <w:t xml:space="preserve">1. OSPF Area Enclosures: When copying this diagram, draw colored boundaries or circles around the components to show the OSPF areas clearly:</w:t>
+      </w:r>
+    </w:p>
+    <w:p>
+      <w:pPr>
+        <w:pStyle w:val="ListParagraph"/>
+        <w:numPr>
+          <w:ilvl w:val="0"/>
+          <w:numId w:val="1"/>
+        </w:numPr>
+        <w:spacing w:after="120" w:before="0" w:line="276"/>
+        <w:jc w:val="left"/>
+      </w:pPr>
+      <w:r>
+        <w:rPr>
+          <w:rFonts w:ascii="Arial" w:cs="Arial" w:eastAsia="Arial" w:hAnsi="Arial"/>
+          <w:b w:val="false"/>
+          <w:bCs w:val="false"/>
+          <w:color w:val="333333"/>
+          <w:sz w:val="22"/>
+          <w:szCs w:val="22"/>
+        </w:rPr>
+        <w:t xml:space="preserve">Area 0 (Backbone): Enclose the Core switches (CORE-SW-A and CORE-SW-B) and their SVL link.</w:t>
+      </w:r>
+    </w:p>
+    <w:p>
+      <w:pPr>
+        <w:pStyle w:val="ListParagraph"/>
+        <w:numPr>
+          <w:ilvl w:val="0"/>
+          <w:numId w:val="1"/>
+        </w:numPr>
+        <w:spacing w:after="120" w:before="0" w:line="276"/>
+        <w:jc w:val="left"/>
+      </w:pPr>
+      <w:r>
+        <w:rPr>
+          <w:rFonts w:ascii="Arial" w:cs="Arial" w:eastAsia="Arial" w:hAnsi="Arial"/>
+          <w:b w:val="false"/>
+          <w:bCs w:val="false"/>
+          <w:color w:val="333333"/>
+          <w:sz w:val="22"/>
+          <w:szCs w:val="22"/>
+        </w:rPr>
+        <w:t xml:space="preserve">Area 1 (Hostels): Enclose the HOSTEL-DIST and Access Stacks (HOSTEL-1/2).</w:t>
+      </w:r>
+    </w:p>
+    <w:p>
+      <w:pPr>
+        <w:pStyle w:val="ListParagraph"/>
+        <w:numPr>
+          <w:ilvl w:val="0"/>
+          <w:numId w:val="1"/>
+        </w:numPr>
+        <w:spacing w:after="120" w:before="0" w:line="276"/>
+        <w:jc w:val="left"/>
+      </w:pPr>
+      <w:r>
+        <w:rPr>
+          <w:rFonts w:ascii="Arial" w:cs="Arial" w:eastAsia="Arial" w:hAnsi="Arial"/>
+          <w:b w:val="false"/>
+          <w:bCs w:val="false"/>
+          <w:color w:val="333333"/>
+          <w:sz w:val="22"/>
+          <w:szCs w:val="22"/>
+        </w:rPr>
+        <w:t xml:space="preserve">Area 2 (Academic): Enclose the ACAD-DIST and Access Stacks (ACAD-1/2/3).</w:t>
+      </w:r>
+    </w:p>
+    <w:p>
+      <w:pPr>
+        <w:pStyle w:val="ListParagraph"/>
+        <w:numPr>
+          <w:ilvl w:val="0"/>
+          <w:numId w:val="1"/>
+        </w:numPr>
+        <w:spacing w:after="120" w:before="0" w:line="276"/>
+        <w:jc w:val="left"/>
+      </w:pPr>
+      <w:r>
+        <w:rPr>
+          <w:rFonts w:ascii="Arial" w:cs="Arial" w:eastAsia="Arial" w:hAnsi="Arial"/>
+          <w:b w:val="false"/>
+          <w:bCs w:val="false"/>
+          <w:color w:val="333333"/>
+          <w:sz w:val="22"/>
+          <w:szCs w:val="22"/>
+        </w:rPr>
+        <w:t xml:space="preserve">Area 3 (Library/Admin): Enclose the LIBADMIN-DIST and Access Stacks (LIB / ADMIN).</w:t>
+      </w:r>
+    </w:p>
+    <w:p>
+      <w:pPr>
+        <w:spacing w:after="120" w:before="0" w:line="276"/>
+        <w:jc w:val="left"/>
+      </w:pPr>
+      <w:r>
+        <w:rPr>
+          <w:rFonts w:ascii="Arial" w:cs="Arial" w:eastAsia="Arial" w:hAnsi="Arial"/>
+          <w:b/>
+          <w:bCs/>
+          <w:color w:val="333333"/>
+          <w:sz w:val="22"/>
+          <w:szCs w:val="22"/>
+        </w:rPr>
+        <w:t xml:space="preserve">2. Interface Labels: Label the trunk lines as Layer 2 trunks and core-to-distribution lines as Layer 3 routed links (/30 subnets).</w:t>
+      </w:r>
+    </w:p>
+    <w:p>
+      <w:pPr>
+        <w:spacing w:after="90" w:before="180" w:line="276"/>
+        <w:jc w:val="left"/>
+      </w:pPr>
+      <w:r>
+        <w:rPr>
+          <w:rFonts w:ascii="Arial" w:cs="Arial" w:eastAsia="Arial" w:hAnsi="Arial"/>
+          <w:b/>
+          <w:bCs/>
+          <w:color w:val="2E5B82"/>
+          <w:sz w:val="24"/>
+          <w:szCs w:val="24"/>
+        </w:rPr>
+        <w:t xml:space="preserve">Recommended Hardware Models:</w:t>
+      </w:r>
+    </w:p>
+    <w:p>
+      <w:pPr>
+        <w:pStyle w:val="ListParagraph"/>
+        <w:numPr>
+          <w:ilvl w:val="0"/>
+          <w:numId w:val="1"/>
+        </w:numPr>
+        <w:spacing w:after="120" w:before="0" w:line="276"/>
+        <w:jc w:val="left"/>
+      </w:pPr>
+      <w:r>
+        <w:rPr>
+          <w:rFonts w:ascii="Arial" w:cs="Arial" w:eastAsia="Arial" w:hAnsi="Arial"/>
+          <w:b w:val="false"/>
+          <w:bCs w:val="false"/>
+          <w:color w:val="333333"/>
+          <w:sz w:val="22"/>
+          <w:szCs w:val="22"/>
+        </w:rPr>
+        <w:t xml:space="preserve">Core Layer Switches: Cisco Catalyst 9500 Series (high-performance, StackWise Virtual supported).</w:t>
+      </w:r>
+    </w:p>
+    <w:p>
+      <w:pPr>
+        <w:pStyle w:val="ListParagraph"/>
+        <w:numPr>
+          <w:ilvl w:val="0"/>
+          <w:numId w:val="1"/>
+        </w:numPr>
+        <w:spacing w:after="120" w:before="0" w:line="276"/>
+        <w:jc w:val="left"/>
+      </w:pPr>
+      <w:r>
+        <w:rPr>
+          <w:rFonts w:ascii="Arial" w:cs="Arial" w:eastAsia="Arial" w:hAnsi="Arial"/>
+          <w:b w:val="false"/>
+          <w:bCs w:val="false"/>
+          <w:color w:val="333333"/>
+          <w:sz w:val="22"/>
+          <w:szCs w:val="22"/>
+        </w:rPr>
+        <w:t xml:space="preserve">Distribution Layer Switches: Cisco Catalyst 9300 or 9500 Series (Layer 3 routing, HSRP gateway).</w:t>
+      </w:r>
+    </w:p>
+    <w:p>
+      <w:pPr>
+        <w:pStyle w:val="ListParagraph"/>
+        <w:numPr>
+          <w:ilvl w:val="0"/>
+          <w:numId w:val="1"/>
+        </w:numPr>
+        <w:spacing w:after="120" w:before="0" w:line="276"/>
+        <w:jc w:val="left"/>
+      </w:pPr>
+      <w:r>
+        <w:rPr>
+          <w:rFonts w:ascii="Arial" w:cs="Arial" w:eastAsia="Arial" w:hAnsi="Arial"/>
+          <w:b w:val="false"/>
+          <w:bCs w:val="false"/>
+          <w:color w:val="333333"/>
+          <w:sz w:val="22"/>
+          <w:szCs w:val="22"/>
+        </w:rPr>
+        <w:t xml:space="preserve">Access Layer Switches: Cisco Catalyst 9300 Series (Layer 2 stackable, PoE support, QoS marking).</w:t>
+      </w:r>
+    </w:p>
+    <w:p>
+      <w:pPr>
+        <w:pStyle w:val="ListParagraph"/>
+        <w:numPr>
+          <w:ilvl w:val="0"/>
+          <w:numId w:val="1"/>
+        </w:numPr>
+        <w:spacing w:after="120" w:before="0" w:line="276"/>
+        <w:jc w:val="left"/>
+      </w:pPr>
+      <w:r>
+        <w:rPr>
+          <w:rFonts w:ascii="Arial" w:cs="Arial" w:eastAsia="Arial" w:hAnsi="Arial"/>
+          <w:b w:val="false"/>
+          <w:bCs w:val="false"/>
+          <w:color w:val="333333"/>
+          <w:sz w:val="22"/>
+          <w:szCs w:val="22"/>
+        </w:rPr>
+        <w:t xml:space="preserve">Edge Routers: Cisco ASR 1001-X and Catalyst 8300 Series.</w:t>
+      </w:r>
+    </w:p>
     <w:p>
       <w:r>
         <w:br w:type="page"/>

</xml_diff>

<commit_message>
Update Page 3 with detailed Switch and Router Hardware Selection
</commit_message>
<xml_diff>
--- a/Handwritten Assignment Guide.docx
+++ b/Handwritten Assignment Guide.docx
@@ -996,7 +996,290 @@
           <w:sz w:val="28"/>
           <w:szCs w:val="28"/>
         </w:rPr>
-        <w:t xml:space="preserve">Page 3: Logical VLSM IP Subnetting Design</w:t>
+        <w:t xml:space="preserve">Page 3: Hardware Selection (Switches &amp; Routers)</w:t>
+      </w:r>
+    </w:p>
+    <w:p>
+      <w:pPr>
+        <w:spacing w:after="120" w:before="0" w:line="276"/>
+        <w:jc w:val="left"/>
+      </w:pPr>
+      <w:r>
+        <w:rPr>
+          <w:rFonts w:ascii="Arial" w:cs="Arial" w:eastAsia="Arial" w:hAnsi="Arial"/>
+          <w:b w:val="false"/>
+          <w:bCs w:val="false"/>
+          <w:color w:val="333333"/>
+          <w:sz w:val="22"/>
+          <w:szCs w:val="22"/>
+        </w:rPr>
+        <w:t xml:space="preserve">To support over 2,500 simultaneous users and guarantee uninterrupted access, the following enterprise-grade Cisco hardware has been selected for each tier of the hierarchical model:</w:t>
+      </w:r>
+    </w:p>
+    <w:p>
+      <w:pPr>
+        <w:spacing w:after="90" w:before="180" w:line="276"/>
+        <w:jc w:val="left"/>
+      </w:pPr>
+      <w:r>
+        <w:rPr>
+          <w:rFonts w:ascii="Arial" w:cs="Arial" w:eastAsia="Arial" w:hAnsi="Arial"/>
+          <w:b/>
+          <w:bCs/>
+          <w:color w:val="2E5B82"/>
+          <w:sz w:val="24"/>
+          <w:szCs w:val="24"/>
+        </w:rPr>
+        <w:t xml:space="preserve">Edge Routing (WAN &amp; Internet): Cisco Catalyst 8300 Series / ASR 1001-X</w:t>
+      </w:r>
+    </w:p>
+    <w:p>
+      <w:pPr>
+        <w:pStyle w:val="ListParagraph"/>
+        <w:numPr>
+          <w:ilvl w:val="0"/>
+          <w:numId w:val="1"/>
+        </w:numPr>
+        <w:spacing w:after="120" w:before="0" w:line="276"/>
+        <w:jc w:val="left"/>
+      </w:pPr>
+      <w:r>
+        <w:rPr>
+          <w:rFonts w:ascii="Arial" w:cs="Arial" w:eastAsia="Arial" w:hAnsi="Arial"/>
+          <w:b w:val="false"/>
+          <w:bCs w:val="false"/>
+          <w:color w:val="333333"/>
+          <w:sz w:val="22"/>
+          <w:szCs w:val="22"/>
+        </w:rPr>
+        <w:t xml:space="preserve">Role: Acts as the secure gateway to the ISPs using eBGP, synchronizes paths via iBGP, and handles outbound NAT/PAT mapping.</w:t>
+      </w:r>
+    </w:p>
+    <w:p>
+      <w:pPr>
+        <w:pStyle w:val="ListParagraph"/>
+        <w:numPr>
+          <w:ilvl w:val="0"/>
+          <w:numId w:val="1"/>
+        </w:numPr>
+        <w:spacing w:after="120" w:before="0" w:line="276"/>
+        <w:jc w:val="left"/>
+      </w:pPr>
+      <w:r>
+        <w:rPr>
+          <w:rFonts w:ascii="Arial" w:cs="Arial" w:eastAsia="Arial" w:hAnsi="Arial"/>
+          <w:b w:val="false"/>
+          <w:bCs w:val="false"/>
+          <w:color w:val="333333"/>
+          <w:sz w:val="22"/>
+          <w:szCs w:val="22"/>
+        </w:rPr>
+        <w:t xml:space="preserve">Selection Rationale: Provides high-throughput hardware routing, deep packet inspection, and the advanced security features necessary for a campus edge boundary.</w:t>
+      </w:r>
+    </w:p>
+    <w:p>
+      <w:pPr>
+        <w:spacing w:after="90" w:before="180" w:line="276"/>
+        <w:jc w:val="left"/>
+      </w:pPr>
+      <w:r>
+        <w:rPr>
+          <w:rFonts w:ascii="Arial" w:cs="Arial" w:eastAsia="Arial" w:hAnsi="Arial"/>
+          <w:b/>
+          <w:bCs/>
+          <w:color w:val="2E5B82"/>
+          <w:sz w:val="24"/>
+          <w:szCs w:val="24"/>
+        </w:rPr>
+        <w:t xml:space="preserve">Core Layer (OSPF Area 0): Cisco Catalyst 9500 Series</w:t>
+      </w:r>
+    </w:p>
+    <w:p>
+      <w:pPr>
+        <w:pStyle w:val="ListParagraph"/>
+        <w:numPr>
+          <w:ilvl w:val="0"/>
+          <w:numId w:val="1"/>
+        </w:numPr>
+        <w:spacing w:after="120" w:before="0" w:line="276"/>
+        <w:jc w:val="left"/>
+      </w:pPr>
+      <w:r>
+        <w:rPr>
+          <w:rFonts w:ascii="Arial" w:cs="Arial" w:eastAsia="Arial" w:hAnsi="Arial"/>
+          <w:b w:val="false"/>
+          <w:bCs w:val="false"/>
+          <w:color w:val="333333"/>
+          <w:sz w:val="22"/>
+          <w:szCs w:val="22"/>
+        </w:rPr>
+        <w:t xml:space="preserve">Role: Functions as the ultra-fast routing backplane. Two units are combined using StackWise Virtual (SVL) to eliminate Spanning Tree loops and enable active-active multi-path forwarding.</w:t>
+      </w:r>
+    </w:p>
+    <w:p>
+      <w:pPr>
+        <w:pStyle w:val="ListParagraph"/>
+        <w:numPr>
+          <w:ilvl w:val="0"/>
+          <w:numId w:val="1"/>
+        </w:numPr>
+        <w:spacing w:after="120" w:before="0" w:line="276"/>
+        <w:jc w:val="left"/>
+      </w:pPr>
+      <w:r>
+        <w:rPr>
+          <w:rFonts w:ascii="Arial" w:cs="Arial" w:eastAsia="Arial" w:hAnsi="Arial"/>
+          <w:b w:val="false"/>
+          <w:bCs w:val="false"/>
+          <w:color w:val="333333"/>
+          <w:sz w:val="22"/>
+          <w:szCs w:val="22"/>
+        </w:rPr>
+        <w:t xml:space="preserve">Selection Rationale: Purpose-built for high-speed enterprise core environments. It easily supports 50ms BFD keepalives to guarantee sub-second link recovery (under 150ms) in the event of a fiber cut.</w:t>
+      </w:r>
+    </w:p>
+    <w:p>
+      <w:pPr>
+        <w:spacing w:after="90" w:before="180" w:line="276"/>
+        <w:jc w:val="left"/>
+      </w:pPr>
+      <w:r>
+        <w:rPr>
+          <w:rFonts w:ascii="Arial" w:cs="Arial" w:eastAsia="Arial" w:hAnsi="Arial"/>
+          <w:b/>
+          <w:bCs/>
+          <w:color w:val="2E5B82"/>
+          <w:sz w:val="24"/>
+          <w:szCs w:val="24"/>
+        </w:rPr>
+        <w:t xml:space="preserve">Distribution Layer (OSPF Areas 1, 2, 3): Cisco Catalyst 9300 Series</w:t>
+      </w:r>
+    </w:p>
+    <w:p>
+      <w:pPr>
+        <w:pStyle w:val="ListParagraph"/>
+        <w:numPr>
+          <w:ilvl w:val="0"/>
+          <w:numId w:val="1"/>
+        </w:numPr>
+        <w:spacing w:after="120" w:before="0" w:line="276"/>
+        <w:jc w:val="left"/>
+      </w:pPr>
+      <w:r>
+        <w:rPr>
+          <w:rFonts w:ascii="Arial" w:cs="Arial" w:eastAsia="Arial" w:hAnsi="Arial"/>
+          <w:b w:val="false"/>
+          <w:bCs w:val="false"/>
+          <w:color w:val="333333"/>
+          <w:sz w:val="22"/>
+          <w:szCs w:val="22"/>
+        </w:rPr>
+        <w:t xml:space="preserve">Role: Operates as Area Border Routers (ABRs) to summarize building subnets. These switches also run HSRP to provide a Virtual IP (VIP) default gateway to the client VLANs.</w:t>
+      </w:r>
+    </w:p>
+    <w:p>
+      <w:pPr>
+        <w:pStyle w:val="ListParagraph"/>
+        <w:numPr>
+          <w:ilvl w:val="0"/>
+          <w:numId w:val="1"/>
+        </w:numPr>
+        <w:spacing w:after="120" w:before="0" w:line="276"/>
+        <w:jc w:val="left"/>
+      </w:pPr>
+      <w:r>
+        <w:rPr>
+          <w:rFonts w:ascii="Arial" w:cs="Arial" w:eastAsia="Arial" w:hAnsi="Arial"/>
+          <w:b w:val="false"/>
+          <w:bCs w:val="false"/>
+          <w:color w:val="333333"/>
+          <w:sz w:val="22"/>
+          <w:szCs w:val="22"/>
+        </w:rPr>
+        <w:t xml:space="preserve">Selection Rationale: Delivers robust Layer 3 capabilities and hardware-accelerated QoS policy enforcement. This is critical for bandwidth shaping and ensuring faculty traffic is prioritized during peak hours.</w:t>
+      </w:r>
+    </w:p>
+    <w:p>
+      <w:pPr>
+        <w:spacing w:after="90" w:before="180" w:line="276"/>
+        <w:jc w:val="left"/>
+      </w:pPr>
+      <w:r>
+        <w:rPr>
+          <w:rFonts w:ascii="Arial" w:cs="Arial" w:eastAsia="Arial" w:hAnsi="Arial"/>
+          <w:b/>
+          <w:bCs/>
+          <w:color w:val="2E5B82"/>
+          <w:sz w:val="24"/>
+          <w:szCs w:val="24"/>
+        </w:rPr>
+        <w:t xml:space="preserve">Access Layer (Edge IDF Closets): Cisco Catalyst 9300 Series</w:t>
+      </w:r>
+    </w:p>
+    <w:p>
+      <w:pPr>
+        <w:pStyle w:val="ListParagraph"/>
+        <w:numPr>
+          <w:ilvl w:val="0"/>
+          <w:numId w:val="1"/>
+        </w:numPr>
+        <w:spacing w:after="120" w:before="0" w:line="276"/>
+        <w:jc w:val="left"/>
+      </w:pPr>
+      <w:r>
+        <w:rPr>
+          <w:rFonts w:ascii="Arial" w:cs="Arial" w:eastAsia="Arial" w:hAnsi="Arial"/>
+          <w:b w:val="false"/>
+          <w:bCs w:val="false"/>
+          <w:color w:val="333333"/>
+          <w:sz w:val="22"/>
+          <w:szCs w:val="22"/>
+        </w:rPr>
+        <w:t xml:space="preserve">Role: Provides physical connectivity, Power-over-Ethernet (PoE), and edge classification for QoS DSCP markings.</w:t>
+      </w:r>
+    </w:p>
+    <w:p>
+      <w:pPr>
+        <w:pStyle w:val="ListParagraph"/>
+        <w:numPr>
+          <w:ilvl w:val="0"/>
+          <w:numId w:val="1"/>
+        </w:numPr>
+        <w:spacing w:after="120" w:before="0" w:line="276"/>
+        <w:jc w:val="left"/>
+      </w:pPr>
+      <w:r>
+        <w:rPr>
+          <w:rFonts w:ascii="Arial" w:cs="Arial" w:eastAsia="Arial" w:hAnsi="Arial"/>
+          <w:b w:val="false"/>
+          <w:bCs w:val="false"/>
+          <w:color w:val="333333"/>
+          <w:sz w:val="22"/>
+          <w:szCs w:val="22"/>
+        </w:rPr>
+        <w:t xml:space="preserve">Selection Rationale: Ensures robust Layer 2 edge security by enforcing Private VLANs (PVLANs) in the hostels, DHCP Snooping, and Dynamic ARP Inspection (DAI) directly at the switchport level.</w:t>
+      </w:r>
+    </w:p>
+    <w:p>
+      <w:r>
+        <w:br w:type="page"/>
+      </w:r>
+    </w:p>
+    <w:p>
+      <w:pPr>
+        <w:spacing w:after="120" w:before="240" w:line="276"/>
+        <w:jc w:val="left"/>
+      </w:pPr>
+      <w:r>
+        <w:rPr>
+          <w:rFonts w:ascii="Arial" w:cs="Arial" w:eastAsia="Arial" w:hAnsi="Arial"/>
+          <w:b/>
+          <w:bCs/>
+          <w:color w:val="1B365D"/>
+          <w:sz w:val="28"/>
+          <w:szCs w:val="28"/>
+        </w:rPr>
+        <w:t xml:space="preserve">Page 4: Logical VLSM IP Subnetting Design</w:t>
       </w:r>
     </w:p>
     <w:p>
@@ -1485,7 +1768,7 @@
                 <w:sz w:val="20"/>
                 <w:szCs w:val="20"/>
               </w:rPr>
-              <w:t xml:space="preserve">10.100.16.0/22 Address Block</w:t>
+              <w:t xml:space="preserve">10.100.16.1 - 10.100.19.254</w:t>
             </w:r>
           </w:p>
         </w:tc>
@@ -1515,119 +1798,119 @@
                 <w:sz w:val="20"/>
                 <w:szCs w:val="20"/>
               </w:rPr>
-              <w:t xml:space="preserve">  - Student VLAN</w:t>
-            </w:r>
-          </w:p>
-        </w:tc>
-        <w:tc>
-          <w:tcPr>
-            <w:tcMar>
-              <w:top w:type="dxa" w:w="100"/>
-              <w:left w:type="dxa" w:w="150"/>
-              <w:bottom w:type="dxa" w:w="100"/>
-              <w:right w:type="dxa" w:w="150"/>
-            </w:tcMar>
-            <w:vAlign w:val="center"/>
-          </w:tcPr>
-          <w:p>
-            <w:pPr>
-              <w:spacing w:after="0" w:before="0" w:line="240"/>
-              <w:jc w:val="left"/>
-            </w:pPr>
-            <w:r>
-              <w:rPr>
-                <w:rFonts w:ascii="Arial" w:cs="Arial" w:eastAsia="Arial" w:hAnsi="Arial"/>
-                <w:b w:val="false"/>
-                <w:bCs w:val="false"/>
-                <w:color w:val="333333"/>
-                <w:sz w:val="20"/>
-                <w:szCs w:val="20"/>
-              </w:rPr>
-              <w:t xml:space="preserve">500 hosts</w:t>
-            </w:r>
-          </w:p>
-        </w:tc>
-        <w:tc>
-          <w:tcPr>
-            <w:tcMar>
-              <w:top w:type="dxa" w:w="100"/>
-              <w:left w:type="dxa" w:w="150"/>
-              <w:bottom w:type="dxa" w:w="100"/>
-              <w:right w:type="dxa" w:w="150"/>
-            </w:tcMar>
-            <w:vAlign w:val="center"/>
-          </w:tcPr>
-          <w:p>
-            <w:pPr>
-              <w:spacing w:after="0" w:before="0" w:line="240"/>
-              <w:jc w:val="left"/>
-            </w:pPr>
-            <w:r>
-              <w:rPr>
-                <w:rFonts w:ascii="Arial" w:cs="Arial" w:eastAsia="Arial" w:hAnsi="Arial"/>
-                <w:b w:val="false"/>
-                <w:bCs w:val="false"/>
-                <w:color w:val="333333"/>
-                <w:sz w:val="20"/>
-                <w:szCs w:val="20"/>
-              </w:rPr>
-              <w:t xml:space="preserve">/23</w:t>
-            </w:r>
-          </w:p>
-        </w:tc>
-        <w:tc>
-          <w:tcPr>
-            <w:tcMar>
-              <w:top w:type="dxa" w:w="100"/>
-              <w:left w:type="dxa" w:w="150"/>
-              <w:bottom w:type="dxa" w:w="100"/>
-              <w:right w:type="dxa" w:w="150"/>
-            </w:tcMar>
-            <w:vAlign w:val="center"/>
-          </w:tcPr>
-          <w:p>
-            <w:pPr>
-              <w:spacing w:after="0" w:before="0" w:line="240"/>
-              <w:jc w:val="left"/>
-            </w:pPr>
-            <w:r>
-              <w:rPr>
-                <w:rFonts w:ascii="Arial" w:cs="Arial" w:eastAsia="Arial" w:hAnsi="Arial"/>
-                <w:b w:val="false"/>
-                <w:bCs w:val="false"/>
-                <w:color w:val="333333"/>
-                <w:sz w:val="20"/>
-                <w:szCs w:val="20"/>
-              </w:rPr>
-              <w:t xml:space="preserve">10.100.16.0/23</w:t>
-            </w:r>
-          </w:p>
-        </w:tc>
-        <w:tc>
-          <w:tcPr>
-            <w:tcMar>
-              <w:top w:type="dxa" w:w="100"/>
-              <w:left w:type="dxa" w:w="150"/>
-              <w:bottom w:type="dxa" w:w="100"/>
-              <w:right w:type="dxa" w:w="150"/>
-            </w:tcMar>
-            <w:vAlign w:val="center"/>
-          </w:tcPr>
-          <w:p>
-            <w:pPr>
-              <w:spacing w:after="0" w:before="0" w:line="240"/>
-              <w:jc w:val="left"/>
-            </w:pPr>
-            <w:r>
-              <w:rPr>
-                <w:rFonts w:ascii="Arial" w:cs="Arial" w:eastAsia="Arial" w:hAnsi="Arial"/>
-                <w:b w:val="false"/>
-                <w:bCs w:val="false"/>
-                <w:color w:val="333333"/>
-                <w:sz w:val="20"/>
-                <w:szCs w:val="20"/>
-              </w:rPr>
-              <w:t xml:space="preserve">10.100.16.1 - 10.100.17.254</w:t>
+              <w:t xml:space="preserve">Academic Block 2</w:t>
+            </w:r>
+          </w:p>
+        </w:tc>
+        <w:tc>
+          <w:tcPr>
+            <w:tcMar>
+              <w:top w:type="dxa" w:w="100"/>
+              <w:left w:type="dxa" w:w="150"/>
+              <w:bottom w:type="dxa" w:w="100"/>
+              <w:right w:type="dxa" w:w="150"/>
+            </w:tcMar>
+            <w:vAlign w:val="center"/>
+          </w:tcPr>
+          <w:p>
+            <w:pPr>
+              <w:spacing w:after="0" w:before="0" w:line="240"/>
+              <w:jc w:val="left"/>
+            </w:pPr>
+            <w:r>
+              <w:rPr>
+                <w:rFonts w:ascii="Arial" w:cs="Arial" w:eastAsia="Arial" w:hAnsi="Arial"/>
+                <w:b w:val="false"/>
+                <w:bCs w:val="false"/>
+                <w:color w:val="333333"/>
+                <w:sz w:val="20"/>
+                <w:szCs w:val="20"/>
+              </w:rPr>
+              <w:t xml:space="preserve">1,000 hosts</w:t>
+            </w:r>
+          </w:p>
+        </w:tc>
+        <w:tc>
+          <w:tcPr>
+            <w:tcMar>
+              <w:top w:type="dxa" w:w="100"/>
+              <w:left w:type="dxa" w:w="150"/>
+              <w:bottom w:type="dxa" w:w="100"/>
+              <w:right w:type="dxa" w:w="150"/>
+            </w:tcMar>
+            <w:vAlign w:val="center"/>
+          </w:tcPr>
+          <w:p>
+            <w:pPr>
+              <w:spacing w:after="0" w:before="0" w:line="240"/>
+              <w:jc w:val="left"/>
+            </w:pPr>
+            <w:r>
+              <w:rPr>
+                <w:rFonts w:ascii="Arial" w:cs="Arial" w:eastAsia="Arial" w:hAnsi="Arial"/>
+                <w:b w:val="false"/>
+                <w:bCs w:val="false"/>
+                <w:color w:val="333333"/>
+                <w:sz w:val="20"/>
+                <w:szCs w:val="20"/>
+              </w:rPr>
+              <w:t xml:space="preserve">/22</w:t>
+            </w:r>
+          </w:p>
+        </w:tc>
+        <w:tc>
+          <w:tcPr>
+            <w:tcMar>
+              <w:top w:type="dxa" w:w="100"/>
+              <w:left w:type="dxa" w:w="150"/>
+              <w:bottom w:type="dxa" w:w="100"/>
+              <w:right w:type="dxa" w:w="150"/>
+            </w:tcMar>
+            <w:vAlign w:val="center"/>
+          </w:tcPr>
+          <w:p>
+            <w:pPr>
+              <w:spacing w:after="0" w:before="0" w:line="240"/>
+              <w:jc w:val="left"/>
+            </w:pPr>
+            <w:r>
+              <w:rPr>
+                <w:rFonts w:ascii="Arial" w:cs="Arial" w:eastAsia="Arial" w:hAnsi="Arial"/>
+                <w:b w:val="false"/>
+                <w:bCs w:val="false"/>
+                <w:color w:val="333333"/>
+                <w:sz w:val="20"/>
+                <w:szCs w:val="20"/>
+              </w:rPr>
+              <w:t xml:space="preserve">10.100.20.0/22</w:t>
+            </w:r>
+          </w:p>
+        </w:tc>
+        <w:tc>
+          <w:tcPr>
+            <w:tcMar>
+              <w:top w:type="dxa" w:w="100"/>
+              <w:left w:type="dxa" w:w="150"/>
+              <w:bottom w:type="dxa" w:w="100"/>
+              <w:right w:type="dxa" w:w="150"/>
+            </w:tcMar>
+            <w:vAlign w:val="center"/>
+          </w:tcPr>
+          <w:p>
+            <w:pPr>
+              <w:spacing w:after="0" w:before="0" w:line="240"/>
+              <w:jc w:val="left"/>
+            </w:pPr>
+            <w:r>
+              <w:rPr>
+                <w:rFonts w:ascii="Arial" w:cs="Arial" w:eastAsia="Arial" w:hAnsi="Arial"/>
+                <w:b w:val="false"/>
+                <w:bCs w:val="false"/>
+                <w:color w:val="333333"/>
+                <w:sz w:val="20"/>
+                <w:szCs w:val="20"/>
+              </w:rPr>
+              <w:t xml:space="preserve">10.100.20.1 - 10.100.23.254</w:t>
             </w:r>
           </w:p>
         </w:tc>
@@ -1658,7 +1941,7 @@
                 <w:sz w:val="20"/>
                 <w:szCs w:val="20"/>
               </w:rPr>
-              <w:t xml:space="preserve">  - Faculty VLAN</w:t>
+              <w:t xml:space="preserve">Academic Block 3</w:t>
             </w:r>
           </w:p>
         </w:tc>
@@ -1687,7 +1970,7 @@
                 <w:sz w:val="20"/>
                 <w:szCs w:val="20"/>
               </w:rPr>
-              <w:t xml:space="preserve">250 hosts</w:t>
+              <w:t xml:space="preserve">1,000 hosts</w:t>
             </w:r>
           </w:p>
         </w:tc>
@@ -1716,7 +1999,7 @@
                 <w:sz w:val="20"/>
                 <w:szCs w:val="20"/>
               </w:rPr>
-              <w:t xml:space="preserve">/24</w:t>
+              <w:t xml:space="preserve">/22</w:t>
             </w:r>
           </w:p>
         </w:tc>
@@ -1745,7 +2028,7 @@
                 <w:sz w:val="20"/>
                 <w:szCs w:val="20"/>
               </w:rPr>
-              <w:t xml:space="preserve">10.100.18.0/24</w:t>
+              <w:t xml:space="preserve">10.100.24.0/22</w:t>
             </w:r>
           </w:p>
         </w:tc>
@@ -1774,7 +2057,7 @@
                 <w:sz w:val="20"/>
                 <w:szCs w:val="20"/>
               </w:rPr>
-              <w:t xml:space="preserve">10.100.18.1 - 10.100.18.254</w:t>
+              <w:t xml:space="preserve">10.100.24.1 - 10.100.27.254</w:t>
             </w:r>
           </w:p>
         </w:tc>
@@ -1804,119 +2087,119 @@
                 <w:sz w:val="20"/>
                 <w:szCs w:val="20"/>
               </w:rPr>
-              <w:t xml:space="preserve">  - IoT &amp; VoIP</w:t>
-            </w:r>
-          </w:p>
-        </w:tc>
-        <w:tc>
-          <w:tcPr>
-            <w:tcMar>
-              <w:top w:type="dxa" w:w="100"/>
-              <w:left w:type="dxa" w:w="150"/>
-              <w:bottom w:type="dxa" w:w="100"/>
-              <w:right w:type="dxa" w:w="150"/>
-            </w:tcMar>
-            <w:vAlign w:val="center"/>
-          </w:tcPr>
-          <w:p>
-            <w:pPr>
-              <w:spacing w:after="0" w:before="0" w:line="240"/>
-              <w:jc w:val="left"/>
-            </w:pPr>
-            <w:r>
-              <w:rPr>
-                <w:rFonts w:ascii="Arial" w:cs="Arial" w:eastAsia="Arial" w:hAnsi="Arial"/>
-                <w:b w:val="false"/>
-                <w:bCs w:val="false"/>
-                <w:color w:val="333333"/>
-                <w:sz w:val="20"/>
-                <w:szCs w:val="20"/>
-              </w:rPr>
-              <w:t xml:space="preserve">250 hosts</w:t>
-            </w:r>
-          </w:p>
-        </w:tc>
-        <w:tc>
-          <w:tcPr>
-            <w:tcMar>
-              <w:top w:type="dxa" w:w="100"/>
-              <w:left w:type="dxa" w:w="150"/>
-              <w:bottom w:type="dxa" w:w="100"/>
-              <w:right w:type="dxa" w:w="150"/>
-            </w:tcMar>
-            <w:vAlign w:val="center"/>
-          </w:tcPr>
-          <w:p>
-            <w:pPr>
-              <w:spacing w:after="0" w:before="0" w:line="240"/>
-              <w:jc w:val="left"/>
-            </w:pPr>
-            <w:r>
-              <w:rPr>
-                <w:rFonts w:ascii="Arial" w:cs="Arial" w:eastAsia="Arial" w:hAnsi="Arial"/>
-                <w:b w:val="false"/>
-                <w:bCs w:val="false"/>
-                <w:color w:val="333333"/>
-                <w:sz w:val="20"/>
-                <w:szCs w:val="20"/>
-              </w:rPr>
-              <w:t xml:space="preserve">/24</w:t>
-            </w:r>
-          </w:p>
-        </w:tc>
-        <w:tc>
-          <w:tcPr>
-            <w:tcMar>
-              <w:top w:type="dxa" w:w="100"/>
-              <w:left w:type="dxa" w:w="150"/>
-              <w:bottom w:type="dxa" w:w="100"/>
-              <w:right w:type="dxa" w:w="150"/>
-            </w:tcMar>
-            <w:vAlign w:val="center"/>
-          </w:tcPr>
-          <w:p>
-            <w:pPr>
-              <w:spacing w:after="0" w:before="0" w:line="240"/>
-              <w:jc w:val="left"/>
-            </w:pPr>
-            <w:r>
-              <w:rPr>
-                <w:rFonts w:ascii="Arial" w:cs="Arial" w:eastAsia="Arial" w:hAnsi="Arial"/>
-                <w:b w:val="false"/>
-                <w:bCs w:val="false"/>
-                <w:color w:val="333333"/>
-                <w:sz w:val="20"/>
-                <w:szCs w:val="20"/>
-              </w:rPr>
-              <w:t xml:space="preserve">10.100.19.0/24</w:t>
-            </w:r>
-          </w:p>
-        </w:tc>
-        <w:tc>
-          <w:tcPr>
-            <w:tcMar>
-              <w:top w:type="dxa" w:w="100"/>
-              <w:left w:type="dxa" w:w="150"/>
-              <w:bottom w:type="dxa" w:w="100"/>
-              <w:right w:type="dxa" w:w="150"/>
-            </w:tcMar>
-            <w:vAlign w:val="center"/>
-          </w:tcPr>
-          <w:p>
-            <w:pPr>
-              <w:spacing w:after="0" w:before="0" w:line="240"/>
-              <w:jc w:val="left"/>
-            </w:pPr>
-            <w:r>
-              <w:rPr>
-                <w:rFonts w:ascii="Arial" w:cs="Arial" w:eastAsia="Arial" w:hAnsi="Arial"/>
-                <w:b w:val="false"/>
-                <w:bCs w:val="false"/>
-                <w:color w:val="333333"/>
-                <w:sz w:val="20"/>
-                <w:szCs w:val="20"/>
-              </w:rPr>
-              <w:t xml:space="preserve">10.100.19.1 - 10.100.19.254</w:t>
+              <w:t xml:space="preserve">Central Library</w:t>
+            </w:r>
+          </w:p>
+        </w:tc>
+        <w:tc>
+          <w:tcPr>
+            <w:tcMar>
+              <w:top w:type="dxa" w:w="100"/>
+              <w:left w:type="dxa" w:w="150"/>
+              <w:bottom w:type="dxa" w:w="100"/>
+              <w:right w:type="dxa" w:w="150"/>
+            </w:tcMar>
+            <w:vAlign w:val="center"/>
+          </w:tcPr>
+          <w:p>
+            <w:pPr>
+              <w:spacing w:after="0" w:before="0" w:line="240"/>
+              <w:jc w:val="left"/>
+            </w:pPr>
+            <w:r>
+              <w:rPr>
+                <w:rFonts w:ascii="Arial" w:cs="Arial" w:eastAsia="Arial" w:hAnsi="Arial"/>
+                <w:b w:val="false"/>
+                <w:bCs w:val="false"/>
+                <w:color w:val="333333"/>
+                <w:sz w:val="20"/>
+                <w:szCs w:val="20"/>
+              </w:rPr>
+              <w:t xml:space="preserve">500 hosts</w:t>
+            </w:r>
+          </w:p>
+        </w:tc>
+        <w:tc>
+          <w:tcPr>
+            <w:tcMar>
+              <w:top w:type="dxa" w:w="100"/>
+              <w:left w:type="dxa" w:w="150"/>
+              <w:bottom w:type="dxa" w:w="100"/>
+              <w:right w:type="dxa" w:w="150"/>
+            </w:tcMar>
+            <w:vAlign w:val="center"/>
+          </w:tcPr>
+          <w:p>
+            <w:pPr>
+              <w:spacing w:after="0" w:before="0" w:line="240"/>
+              <w:jc w:val="left"/>
+            </w:pPr>
+            <w:r>
+              <w:rPr>
+                <w:rFonts w:ascii="Arial" w:cs="Arial" w:eastAsia="Arial" w:hAnsi="Arial"/>
+                <w:b w:val="false"/>
+                <w:bCs w:val="false"/>
+                <w:color w:val="333333"/>
+                <w:sz w:val="20"/>
+                <w:szCs w:val="20"/>
+              </w:rPr>
+              <w:t xml:space="preserve">/23</w:t>
+            </w:r>
+          </w:p>
+        </w:tc>
+        <w:tc>
+          <w:tcPr>
+            <w:tcMar>
+              <w:top w:type="dxa" w:w="100"/>
+              <w:left w:type="dxa" w:w="150"/>
+              <w:bottom w:type="dxa" w:w="100"/>
+              <w:right w:type="dxa" w:w="150"/>
+            </w:tcMar>
+            <w:vAlign w:val="center"/>
+          </w:tcPr>
+          <w:p>
+            <w:pPr>
+              <w:spacing w:after="0" w:before="0" w:line="240"/>
+              <w:jc w:val="left"/>
+            </w:pPr>
+            <w:r>
+              <w:rPr>
+                <w:rFonts w:ascii="Arial" w:cs="Arial" w:eastAsia="Arial" w:hAnsi="Arial"/>
+                <w:b w:val="false"/>
+                <w:bCs w:val="false"/>
+                <w:color w:val="333333"/>
+                <w:sz w:val="20"/>
+                <w:szCs w:val="20"/>
+              </w:rPr>
+              <w:t xml:space="preserve">10.100.28.0/23</w:t>
+            </w:r>
+          </w:p>
+        </w:tc>
+        <w:tc>
+          <w:tcPr>
+            <w:tcMar>
+              <w:top w:type="dxa" w:w="100"/>
+              <w:left w:type="dxa" w:w="150"/>
+              <w:bottom w:type="dxa" w:w="100"/>
+              <w:right w:type="dxa" w:w="150"/>
+            </w:tcMar>
+            <w:vAlign w:val="center"/>
+          </w:tcPr>
+          <w:p>
+            <w:pPr>
+              <w:spacing w:after="0" w:before="0" w:line="240"/>
+              <w:jc w:val="left"/>
+            </w:pPr>
+            <w:r>
+              <w:rPr>
+                <w:rFonts w:ascii="Arial" w:cs="Arial" w:eastAsia="Arial" w:hAnsi="Arial"/>
+                <w:b w:val="false"/>
+                <w:bCs w:val="false"/>
+                <w:color w:val="333333"/>
+                <w:sz w:val="20"/>
+                <w:szCs w:val="20"/>
+              </w:rPr>
+              <w:t xml:space="preserve">10.100.28.1 - 10.100.29.254</w:t>
             </w:r>
           </w:p>
         </w:tc>
@@ -1947,7 +2230,7 @@
                 <w:sz w:val="20"/>
                 <w:szCs w:val="20"/>
               </w:rPr>
-              <w:t xml:space="preserve">Academic Block 2</w:t>
+              <w:t xml:space="preserve">Administration</w:t>
             </w:r>
           </w:p>
         </w:tc>
@@ -1976,7 +2259,7 @@
                 <w:sz w:val="20"/>
                 <w:szCs w:val="20"/>
               </w:rPr>
-              <w:t xml:space="preserve">1,000 hosts</w:t>
+              <w:t xml:space="preserve">250 hosts</w:t>
             </w:r>
           </w:p>
         </w:tc>
@@ -2005,7 +2288,7 @@
                 <w:sz w:val="20"/>
                 <w:szCs w:val="20"/>
               </w:rPr>
-              <w:t xml:space="preserve">/22</w:t>
+              <w:t xml:space="preserve">/24</w:t>
             </w:r>
           </w:p>
         </w:tc>
@@ -2034,444 +2317,13 @@
                 <w:sz w:val="20"/>
                 <w:szCs w:val="20"/>
               </w:rPr>
-              <w:t xml:space="preserve">10.100.20.0/22</w:t>
+              <w:t xml:space="preserve">10.100.30.0/24</w:t>
             </w:r>
           </w:p>
         </w:tc>
         <w:tc>
           <w:tcPr>
             <w:shd w:fill="F4F6F9"/>
-            <w:tcMar>
-              <w:top w:type="dxa" w:w="100"/>
-              <w:left w:type="dxa" w:w="150"/>
-              <w:bottom w:type="dxa" w:w="100"/>
-              <w:right w:type="dxa" w:w="150"/>
-            </w:tcMar>
-            <w:vAlign w:val="center"/>
-          </w:tcPr>
-          <w:p>
-            <w:pPr>
-              <w:spacing w:after="0" w:before="0" w:line="240"/>
-              <w:jc w:val="left"/>
-            </w:pPr>
-            <w:r>
-              <w:rPr>
-                <w:rFonts w:ascii="Arial" w:cs="Arial" w:eastAsia="Arial" w:hAnsi="Arial"/>
-                <w:b w:val="false"/>
-                <w:bCs w:val="false"/>
-                <w:color w:val="333333"/>
-                <w:sz w:val="20"/>
-                <w:szCs w:val="20"/>
-              </w:rPr>
-              <w:t xml:space="preserve">Sub-partitioned same as Block 1</w:t>
-            </w:r>
-          </w:p>
-        </w:tc>
-      </w:tr>
-      <w:tr>
-        <w:tc>
-          <w:tcPr>
-            <w:tcMar>
-              <w:top w:type="dxa" w:w="100"/>
-              <w:left w:type="dxa" w:w="150"/>
-              <w:bottom w:type="dxa" w:w="100"/>
-              <w:right w:type="dxa" w:w="150"/>
-            </w:tcMar>
-            <w:vAlign w:val="center"/>
-          </w:tcPr>
-          <w:p>
-            <w:pPr>
-              <w:spacing w:after="0" w:before="0" w:line="240"/>
-              <w:jc w:val="left"/>
-            </w:pPr>
-            <w:r>
-              <w:rPr>
-                <w:rFonts w:ascii="Arial" w:cs="Arial" w:eastAsia="Arial" w:hAnsi="Arial"/>
-                <w:b w:val="false"/>
-                <w:bCs w:val="false"/>
-                <w:color w:val="333333"/>
-                <w:sz w:val="20"/>
-                <w:szCs w:val="20"/>
-              </w:rPr>
-              <w:t xml:space="preserve">Academic Block 3</w:t>
-            </w:r>
-          </w:p>
-        </w:tc>
-        <w:tc>
-          <w:tcPr>
-            <w:tcMar>
-              <w:top w:type="dxa" w:w="100"/>
-              <w:left w:type="dxa" w:w="150"/>
-              <w:bottom w:type="dxa" w:w="100"/>
-              <w:right w:type="dxa" w:w="150"/>
-            </w:tcMar>
-            <w:vAlign w:val="center"/>
-          </w:tcPr>
-          <w:p>
-            <w:pPr>
-              <w:spacing w:after="0" w:before="0" w:line="240"/>
-              <w:jc w:val="left"/>
-            </w:pPr>
-            <w:r>
-              <w:rPr>
-                <w:rFonts w:ascii="Arial" w:cs="Arial" w:eastAsia="Arial" w:hAnsi="Arial"/>
-                <w:b w:val="false"/>
-                <w:bCs w:val="false"/>
-                <w:color w:val="333333"/>
-                <w:sz w:val="20"/>
-                <w:szCs w:val="20"/>
-              </w:rPr>
-              <w:t xml:space="preserve">1,000 hosts</w:t>
-            </w:r>
-          </w:p>
-        </w:tc>
-        <w:tc>
-          <w:tcPr>
-            <w:tcMar>
-              <w:top w:type="dxa" w:w="100"/>
-              <w:left w:type="dxa" w:w="150"/>
-              <w:bottom w:type="dxa" w:w="100"/>
-              <w:right w:type="dxa" w:w="150"/>
-            </w:tcMar>
-            <w:vAlign w:val="center"/>
-          </w:tcPr>
-          <w:p>
-            <w:pPr>
-              <w:spacing w:after="0" w:before="0" w:line="240"/>
-              <w:jc w:val="left"/>
-            </w:pPr>
-            <w:r>
-              <w:rPr>
-                <w:rFonts w:ascii="Arial" w:cs="Arial" w:eastAsia="Arial" w:hAnsi="Arial"/>
-                <w:b w:val="false"/>
-                <w:bCs w:val="false"/>
-                <w:color w:val="333333"/>
-                <w:sz w:val="20"/>
-                <w:szCs w:val="20"/>
-              </w:rPr>
-              <w:t xml:space="preserve">/22</w:t>
-            </w:r>
-          </w:p>
-        </w:tc>
-        <w:tc>
-          <w:tcPr>
-            <w:tcMar>
-              <w:top w:type="dxa" w:w="100"/>
-              <w:left w:type="dxa" w:w="150"/>
-              <w:bottom w:type="dxa" w:w="100"/>
-              <w:right w:type="dxa" w:w="150"/>
-            </w:tcMar>
-            <w:vAlign w:val="center"/>
-          </w:tcPr>
-          <w:p>
-            <w:pPr>
-              <w:spacing w:after="0" w:before="0" w:line="240"/>
-              <w:jc w:val="left"/>
-            </w:pPr>
-            <w:r>
-              <w:rPr>
-                <w:rFonts w:ascii="Arial" w:cs="Arial" w:eastAsia="Arial" w:hAnsi="Arial"/>
-                <w:b w:val="false"/>
-                <w:bCs w:val="false"/>
-                <w:color w:val="333333"/>
-                <w:sz w:val="20"/>
-                <w:szCs w:val="20"/>
-              </w:rPr>
-              <w:t xml:space="preserve">10.100.24.0/22</w:t>
-            </w:r>
-          </w:p>
-        </w:tc>
-        <w:tc>
-          <w:tcPr>
-            <w:tcMar>
-              <w:top w:type="dxa" w:w="100"/>
-              <w:left w:type="dxa" w:w="150"/>
-              <w:bottom w:type="dxa" w:w="100"/>
-              <w:right w:type="dxa" w:w="150"/>
-            </w:tcMar>
-            <w:vAlign w:val="center"/>
-          </w:tcPr>
-          <w:p>
-            <w:pPr>
-              <w:spacing w:after="0" w:before="0" w:line="240"/>
-              <w:jc w:val="left"/>
-            </w:pPr>
-            <w:r>
-              <w:rPr>
-                <w:rFonts w:ascii="Arial" w:cs="Arial" w:eastAsia="Arial" w:hAnsi="Arial"/>
-                <w:b w:val="false"/>
-                <w:bCs w:val="false"/>
-                <w:color w:val="333333"/>
-                <w:sz w:val="20"/>
-                <w:szCs w:val="20"/>
-              </w:rPr>
-              <w:t xml:space="preserve">Sub-partitioned same as Block 1</w:t>
-            </w:r>
-          </w:p>
-        </w:tc>
-      </w:tr>
-      <w:tr>
-        <w:tc>
-          <w:tcPr>
-            <w:shd w:fill="F4F6F9"/>
-            <w:tcMar>
-              <w:top w:type="dxa" w:w="100"/>
-              <w:left w:type="dxa" w:w="150"/>
-              <w:bottom w:type="dxa" w:w="100"/>
-              <w:right w:type="dxa" w:w="150"/>
-            </w:tcMar>
-            <w:vAlign w:val="center"/>
-          </w:tcPr>
-          <w:p>
-            <w:pPr>
-              <w:spacing w:after="0" w:before="0" w:line="240"/>
-              <w:jc w:val="left"/>
-            </w:pPr>
-            <w:r>
-              <w:rPr>
-                <w:rFonts w:ascii="Arial" w:cs="Arial" w:eastAsia="Arial" w:hAnsi="Arial"/>
-                <w:b w:val="false"/>
-                <w:bCs w:val="false"/>
-                <w:color w:val="333333"/>
-                <w:sz w:val="20"/>
-                <w:szCs w:val="20"/>
-              </w:rPr>
-              <w:t xml:space="preserve">Central Library</w:t>
-            </w:r>
-          </w:p>
-        </w:tc>
-        <w:tc>
-          <w:tcPr>
-            <w:shd w:fill="F4F6F9"/>
-            <w:tcMar>
-              <w:top w:type="dxa" w:w="100"/>
-              <w:left w:type="dxa" w:w="150"/>
-              <w:bottom w:type="dxa" w:w="100"/>
-              <w:right w:type="dxa" w:w="150"/>
-            </w:tcMar>
-            <w:vAlign w:val="center"/>
-          </w:tcPr>
-          <w:p>
-            <w:pPr>
-              <w:spacing w:after="0" w:before="0" w:line="240"/>
-              <w:jc w:val="left"/>
-            </w:pPr>
-            <w:r>
-              <w:rPr>
-                <w:rFonts w:ascii="Arial" w:cs="Arial" w:eastAsia="Arial" w:hAnsi="Arial"/>
-                <w:b w:val="false"/>
-                <w:bCs w:val="false"/>
-                <w:color w:val="333333"/>
-                <w:sz w:val="20"/>
-                <w:szCs w:val="20"/>
-              </w:rPr>
-              <w:t xml:space="preserve">500 hosts</w:t>
-            </w:r>
-          </w:p>
-        </w:tc>
-        <w:tc>
-          <w:tcPr>
-            <w:shd w:fill="F4F6F9"/>
-            <w:tcMar>
-              <w:top w:type="dxa" w:w="100"/>
-              <w:left w:type="dxa" w:w="150"/>
-              <w:bottom w:type="dxa" w:w="100"/>
-              <w:right w:type="dxa" w:w="150"/>
-            </w:tcMar>
-            <w:vAlign w:val="center"/>
-          </w:tcPr>
-          <w:p>
-            <w:pPr>
-              <w:spacing w:after="0" w:before="0" w:line="240"/>
-              <w:jc w:val="left"/>
-            </w:pPr>
-            <w:r>
-              <w:rPr>
-                <w:rFonts w:ascii="Arial" w:cs="Arial" w:eastAsia="Arial" w:hAnsi="Arial"/>
-                <w:b w:val="false"/>
-                <w:bCs w:val="false"/>
-                <w:color w:val="333333"/>
-                <w:sz w:val="20"/>
-                <w:szCs w:val="20"/>
-              </w:rPr>
-              <w:t xml:space="preserve">/23</w:t>
-            </w:r>
-          </w:p>
-        </w:tc>
-        <w:tc>
-          <w:tcPr>
-            <w:shd w:fill="F4F6F9"/>
-            <w:tcMar>
-              <w:top w:type="dxa" w:w="100"/>
-              <w:left w:type="dxa" w:w="150"/>
-              <w:bottom w:type="dxa" w:w="100"/>
-              <w:right w:type="dxa" w:w="150"/>
-            </w:tcMar>
-            <w:vAlign w:val="center"/>
-          </w:tcPr>
-          <w:p>
-            <w:pPr>
-              <w:spacing w:after="0" w:before="0" w:line="240"/>
-              <w:jc w:val="left"/>
-            </w:pPr>
-            <w:r>
-              <w:rPr>
-                <w:rFonts w:ascii="Arial" w:cs="Arial" w:eastAsia="Arial" w:hAnsi="Arial"/>
-                <w:b w:val="false"/>
-                <w:bCs w:val="false"/>
-                <w:color w:val="333333"/>
-                <w:sz w:val="20"/>
-                <w:szCs w:val="20"/>
-              </w:rPr>
-              <w:t xml:space="preserve">10.100.28.0/23</w:t>
-            </w:r>
-          </w:p>
-        </w:tc>
-        <w:tc>
-          <w:tcPr>
-            <w:shd w:fill="F4F6F9"/>
-            <w:tcMar>
-              <w:top w:type="dxa" w:w="100"/>
-              <w:left w:type="dxa" w:w="150"/>
-              <w:bottom w:type="dxa" w:w="100"/>
-              <w:right w:type="dxa" w:w="150"/>
-            </w:tcMar>
-            <w:vAlign w:val="center"/>
-          </w:tcPr>
-          <w:p>
-            <w:pPr>
-              <w:spacing w:after="0" w:before="0" w:line="240"/>
-              <w:jc w:val="left"/>
-            </w:pPr>
-            <w:r>
-              <w:rPr>
-                <w:rFonts w:ascii="Arial" w:cs="Arial" w:eastAsia="Arial" w:hAnsi="Arial"/>
-                <w:b w:val="false"/>
-                <w:bCs w:val="false"/>
-                <w:color w:val="333333"/>
-                <w:sz w:val="20"/>
-                <w:szCs w:val="20"/>
-              </w:rPr>
-              <w:t xml:space="preserve">10.100.28.1 - 10.100.29.254</w:t>
-            </w:r>
-          </w:p>
-        </w:tc>
-      </w:tr>
-      <w:tr>
-        <w:tc>
-          <w:tcPr>
-            <w:tcMar>
-              <w:top w:type="dxa" w:w="100"/>
-              <w:left w:type="dxa" w:w="150"/>
-              <w:bottom w:type="dxa" w:w="100"/>
-              <w:right w:type="dxa" w:w="150"/>
-            </w:tcMar>
-            <w:vAlign w:val="center"/>
-          </w:tcPr>
-          <w:p>
-            <w:pPr>
-              <w:spacing w:after="0" w:before="0" w:line="240"/>
-              <w:jc w:val="left"/>
-            </w:pPr>
-            <w:r>
-              <w:rPr>
-                <w:rFonts w:ascii="Arial" w:cs="Arial" w:eastAsia="Arial" w:hAnsi="Arial"/>
-                <w:b w:val="false"/>
-                <w:bCs w:val="false"/>
-                <w:color w:val="333333"/>
-                <w:sz w:val="20"/>
-                <w:szCs w:val="20"/>
-              </w:rPr>
-              <w:t xml:space="preserve">Administration</w:t>
-            </w:r>
-          </w:p>
-        </w:tc>
-        <w:tc>
-          <w:tcPr>
-            <w:tcMar>
-              <w:top w:type="dxa" w:w="100"/>
-              <w:left w:type="dxa" w:w="150"/>
-              <w:bottom w:type="dxa" w:w="100"/>
-              <w:right w:type="dxa" w:w="150"/>
-            </w:tcMar>
-            <w:vAlign w:val="center"/>
-          </w:tcPr>
-          <w:p>
-            <w:pPr>
-              <w:spacing w:after="0" w:before="0" w:line="240"/>
-              <w:jc w:val="left"/>
-            </w:pPr>
-            <w:r>
-              <w:rPr>
-                <w:rFonts w:ascii="Arial" w:cs="Arial" w:eastAsia="Arial" w:hAnsi="Arial"/>
-                <w:b w:val="false"/>
-                <w:bCs w:val="false"/>
-                <w:color w:val="333333"/>
-                <w:sz w:val="20"/>
-                <w:szCs w:val="20"/>
-              </w:rPr>
-              <w:t xml:space="preserve">250 hosts</w:t>
-            </w:r>
-          </w:p>
-        </w:tc>
-        <w:tc>
-          <w:tcPr>
-            <w:tcMar>
-              <w:top w:type="dxa" w:w="100"/>
-              <w:left w:type="dxa" w:w="150"/>
-              <w:bottom w:type="dxa" w:w="100"/>
-              <w:right w:type="dxa" w:w="150"/>
-            </w:tcMar>
-            <w:vAlign w:val="center"/>
-          </w:tcPr>
-          <w:p>
-            <w:pPr>
-              <w:spacing w:after="0" w:before="0" w:line="240"/>
-              <w:jc w:val="left"/>
-            </w:pPr>
-            <w:r>
-              <w:rPr>
-                <w:rFonts w:ascii="Arial" w:cs="Arial" w:eastAsia="Arial" w:hAnsi="Arial"/>
-                <w:b w:val="false"/>
-                <w:bCs w:val="false"/>
-                <w:color w:val="333333"/>
-                <w:sz w:val="20"/>
-                <w:szCs w:val="20"/>
-              </w:rPr>
-              <w:t xml:space="preserve">/24</w:t>
-            </w:r>
-          </w:p>
-        </w:tc>
-        <w:tc>
-          <w:tcPr>
-            <w:tcMar>
-              <w:top w:type="dxa" w:w="100"/>
-              <w:left w:type="dxa" w:w="150"/>
-              <w:bottom w:type="dxa" w:w="100"/>
-              <w:right w:type="dxa" w:w="150"/>
-            </w:tcMar>
-            <w:vAlign w:val="center"/>
-          </w:tcPr>
-          <w:p>
-            <w:pPr>
-              <w:spacing w:after="0" w:before="0" w:line="240"/>
-              <w:jc w:val="left"/>
-            </w:pPr>
-            <w:r>
-              <w:rPr>
-                <w:rFonts w:ascii="Arial" w:cs="Arial" w:eastAsia="Arial" w:hAnsi="Arial"/>
-                <w:b w:val="false"/>
-                <w:bCs w:val="false"/>
-                <w:color w:val="333333"/>
-                <w:sz w:val="20"/>
-                <w:szCs w:val="20"/>
-              </w:rPr>
-              <w:t xml:space="preserve">10.100.30.0/24</w:t>
-            </w:r>
-          </w:p>
-        </w:tc>
-        <w:tc>
-          <w:tcPr>
             <w:tcMar>
               <w:top w:type="dxa" w:w="100"/>
               <w:left w:type="dxa" w:w="150"/>
@@ -2519,24 +2371,24 @@
           <w:sz w:val="28"/>
           <w:szCs w:val="28"/>
         </w:rPr>
-        <w:t xml:space="preserve">Page 4: VLAN Segmentation &amp; IPAM Registry</w:t>
-      </w:r>
-    </w:p>
-    <w:p>
-      <w:pPr>
-        <w:spacing w:after="120" w:before="0" w:line="276"/>
-        <w:jc w:val="left"/>
-      </w:pPr>
-      <w:r>
-        <w:rPr>
-          <w:rFonts w:ascii="Arial" w:cs="Arial" w:eastAsia="Arial" w:hAnsi="Arial"/>
-          <w:b w:val="false"/>
-          <w:bCs w:val="false"/>
-          <w:color w:val="333333"/>
-          <w:sz w:val="22"/>
-          <w:szCs w:val="22"/>
-        </w:rPr>
-        <w:t xml:space="preserve">VLAN boundary isolation localizes broadcast traffic (preventing network storms) and creates security barriers.</w:t>
+        <w:t xml:space="preserve">Page 5: VLAN Segmentation &amp; IPAM Registry</w:t>
+      </w:r>
+    </w:p>
+    <w:p>
+      <w:pPr>
+        <w:spacing w:after="120" w:before="0" w:line="276"/>
+        <w:jc w:val="left"/>
+      </w:pPr>
+      <w:r>
+        <w:rPr>
+          <w:rFonts w:ascii="Arial" w:cs="Arial" w:eastAsia="Arial" w:hAnsi="Arial"/>
+          <w:b w:val="false"/>
+          <w:bCs w:val="false"/>
+          <w:color w:val="333333"/>
+          <w:sz w:val="22"/>
+          <w:szCs w:val="22"/>
+        </w:rPr>
+        <w:t xml:space="preserve">VLAN boundary isolation localizes broadcast traffic and creates security barriers.</w:t>
       </w:r>
     </w:p>
     <w:p>
@@ -3751,7 +3603,7 @@
           <w:sz w:val="28"/>
           <w:szCs w:val="28"/>
         </w:rPr>
-        <w:t xml:space="preserve">Page 5: Dynamic Routing Design (OSPF &amp; BGP)</w:t>
+        <w:t xml:space="preserve">Page 6: Dynamic Routing Design (OSPF &amp; BGP)</w:t>
       </w:r>
     </w:p>
     <w:p>
@@ -3929,7 +3781,7 @@
           <w:sz w:val="28"/>
           <w:szCs w:val="28"/>
         </w:rPr>
-        <w:t xml:space="preserve">Page 6: Redundancy &amp; High Availability (HA)</w:t>
+        <w:t xml:space="preserve">Page 7: Redundancy &amp; High Availability (HA)</w:t>
       </w:r>
     </w:p>
     <w:p>
@@ -4014,7 +3866,7 @@
           <w:sz w:val="22"/>
           <w:szCs w:val="22"/>
         </w:rPr>
-        <w:t xml:space="preserve">HSRP is deployed at the building Distribution switches. A Virtual IP (VIP) is advertised as the default gateway to the client VLANs. If the primary Distribution switch fails, the standby switch instantly assumes the VIP.</w:t>
+        <w:t xml:space="preserve">HSRP is deployed at the building Distribution switches. A Virtual IP acts as default gateway. If the primary Distribution switch fails, the standby switch instantly assumes the VIP.</w:t>
       </w:r>
     </w:p>
     <w:p>
@@ -4070,7 +3922,7 @@
           <w:sz w:val="28"/>
           <w:szCs w:val="28"/>
         </w:rPr>
-        <w:t xml:space="preserve">Page 7: Cybersecurity &amp; Layer 2 Security Policies</w:t>
+        <w:t xml:space="preserve">Page 8: Cybersecurity &amp; Layer 2 Security Policies</w:t>
       </w:r>
     </w:p>
     <w:p>
@@ -4155,7 +4007,7 @@
           <w:sz w:val="22"/>
           <w:szCs w:val="22"/>
         </w:rPr>
-        <w:t xml:space="preserve">Protects against rogue DHCP servers. Switch ports are untrusted by default; only the uplink port connected to the official university DHCP server is configured as trusted.</w:t>
+        <w:t xml:space="preserve">Protects against rogue DHCP servers. Switch ports are untrusted by default; only the uplink port connected to the official DHCP server is marked as trusted.</w:t>
       </w:r>
     </w:p>
     <w:p>
@@ -4189,7 +4041,7 @@
           <w:sz w:val="22"/>
           <w:szCs w:val="22"/>
         </w:rPr>
-        <w:t xml:space="preserve">Compares incoming ARP requests against the DHCP snooping database to prevent Man-in-the-Middle (MitM) and ARP spoofing attacks.</w:t>
+        <w:t xml:space="preserve">Compares incoming ARP requests against the DHCP snooping database to prevent Man-in-the-Middle and ARP spoofing attacks.</w:t>
       </w:r>
     </w:p>
     <w:p>
@@ -4223,7 +4075,7 @@
           <w:sz w:val="22"/>
           <w:szCs w:val="22"/>
         </w:rPr>
-        <w:t xml:space="preserve">Enables fast link-state transitions on client ports while disabling any interface that receives Spanning Tree BPDUs (blocking rogue switches).</w:t>
+        <w:t xml:space="preserve">Enables fast link-state transitions on client ports while disabling any interface that receives Spanning Tree BPDUs.</w:t>
       </w:r>
     </w:p>
     <w:p>
@@ -4245,7 +4097,7 @@
           <w:sz w:val="28"/>
           <w:szCs w:val="28"/>
         </w:rPr>
-        <w:t xml:space="preserve">Page 8: Quality of Service (QoS) &amp; Traffic Engineering</w:t>
+        <w:t xml:space="preserve">Page 9: Quality of Service (QoS) &amp; Traffic Engineering</w:t>
       </w:r>
     </w:p>
     <w:p>
@@ -4386,24 +4238,24 @@
           <w:sz w:val="28"/>
           <w:szCs w:val="28"/>
         </w:rPr>
-        <w:t xml:space="preserve">Page 9: High-Yield CLI Configurations</w:t>
-      </w:r>
-    </w:p>
-    <w:p>
-      <w:pPr>
-        <w:spacing w:after="120" w:before="0" w:line="276"/>
-        <w:jc w:val="left"/>
-      </w:pPr>
-      <w:r>
-        <w:rPr>
-          <w:rFonts w:ascii="Arial" w:cs="Arial" w:eastAsia="Arial" w:hAnsi="Arial"/>
-          <w:b w:val="false"/>
-          <w:bCs w:val="false"/>
-          <w:color w:val="333333"/>
-          <w:sz w:val="22"/>
-          <w:szCs w:val="22"/>
-        </w:rPr>
-        <w:t xml:space="preserve">The following simplified configurations can be copied to demonstrate real-world deployment:</w:t>
+        <w:t xml:space="preserve">Page 10: High-Yield CLI Configurations &amp; Design Verification</w:t>
+      </w:r>
+    </w:p>
+    <w:p>
+      <w:pPr>
+        <w:spacing w:after="120" w:before="0" w:line="276"/>
+        <w:jc w:val="left"/>
+      </w:pPr>
+      <w:r>
+        <w:rPr>
+          <w:rFonts w:ascii="Arial" w:cs="Arial" w:eastAsia="Arial" w:hAnsi="Arial"/>
+          <w:b w:val="false"/>
+          <w:bCs w:val="false"/>
+          <w:color w:val="333333"/>
+          <w:sz w:val="22"/>
+          <w:szCs w:val="22"/>
+        </w:rPr>
+        <w:t xml:space="preserve">The following configurations can be copied to demonstrate real-world deployment along with operational benefits:</w:t>
       </w:r>
     </w:p>
     <w:p>
@@ -4494,7 +4346,7 @@
                 <w:sz w:val="18"/>
                 <w:szCs w:val="18"/>
               </w:rPr>
-              <w:t xml:space="preserve">interface Loopback0</w:t>
+              <w:t xml:space="preserve">interface TenGigabitEthernet1/0/1</w:t>
             </w:r>
           </w:p>
           <w:p>
@@ -4508,7 +4360,7 @@
                 <w:sz w:val="18"/>
                 <w:szCs w:val="18"/>
               </w:rPr>
-              <w:t xml:space="preserve"> ip address 10.255.255.1 255.255.255.255</w:t>
+              <w:t xml:space="preserve"> ip ospf network point-to-point</w:t>
             </w:r>
           </w:p>
           <w:p>
@@ -4522,7 +4374,7 @@
                 <w:sz w:val="18"/>
                 <w:szCs w:val="18"/>
               </w:rPr>
-              <w:t xml:space="preserve"> exit</w:t>
+              <w:t xml:space="preserve"> bfd interval 50 min_rx 50 multiplier 3</w:t>
             </w:r>
           </w:p>
           <w:p>
@@ -4536,217 +4388,7 @@
                 <w:sz w:val="18"/>
                 <w:szCs w:val="18"/>
               </w:rPr>
-              <w:t xml:space="preserve">!</w:t>
-            </w:r>
-          </w:p>
-          <w:p>
-            <w:pPr>
-              <w:spacing w:after="0" w:before="0" w:line="200"/>
-            </w:pPr>
-            <w:r>
-              <w:rPr>
-                <w:rFonts w:ascii="Consolas" w:cs="Consolas" w:eastAsia="Consolas" w:hAnsi="Consolas"/>
-                <w:color w:val="2D3748"/>
-                <w:sz w:val="18"/>
-                <w:szCs w:val="18"/>
-              </w:rPr>
-              <w:t xml:space="preserve">interface TenGigabitEthernet1/0/1</w:t>
-            </w:r>
-          </w:p>
-          <w:p>
-            <w:pPr>
-              <w:spacing w:after="0" w:before="0" w:line="200"/>
-            </w:pPr>
-            <w:r>
-              <w:rPr>
-                <w:rFonts w:ascii="Consolas" w:cs="Consolas" w:eastAsia="Consolas" w:hAnsi="Consolas"/>
-                <w:color w:val="2D3748"/>
-                <w:sz w:val="18"/>
-                <w:szCs w:val="18"/>
-              </w:rPr>
-              <w:t xml:space="preserve"> description Link to ACAD-DIST</w:t>
-            </w:r>
-          </w:p>
-          <w:p>
-            <w:pPr>
-              <w:spacing w:after="0" w:before="0" w:line="200"/>
-            </w:pPr>
-            <w:r>
-              <w:rPr>
-                <w:rFonts w:ascii="Consolas" w:cs="Consolas" w:eastAsia="Consolas" w:hAnsi="Consolas"/>
-                <w:color w:val="2D3748"/>
-                <w:sz w:val="18"/>
-                <w:szCs w:val="18"/>
-              </w:rPr>
-              <w:t xml:space="preserve"> no switchport</w:t>
-            </w:r>
-          </w:p>
-          <w:p>
-            <w:pPr>
-              <w:spacing w:after="0" w:before="0" w:line="200"/>
-            </w:pPr>
-            <w:r>
-              <w:rPr>
-                <w:rFonts w:ascii="Consolas" w:cs="Consolas" w:eastAsia="Consolas" w:hAnsi="Consolas"/>
-                <w:color w:val="2D3748"/>
-                <w:sz w:val="18"/>
-                <w:szCs w:val="18"/>
-              </w:rPr>
-              <w:t xml:space="preserve"> ip address 10.100.255.1 255.255.255.252</w:t>
-            </w:r>
-          </w:p>
-          <w:p>
-            <w:pPr>
-              <w:spacing w:after="0" w:before="0" w:line="200"/>
-            </w:pPr>
-            <w:r>
-              <w:rPr>
-                <w:rFonts w:ascii="Consolas" w:cs="Consolas" w:eastAsia="Consolas" w:hAnsi="Consolas"/>
-                <w:color w:val="2D3748"/>
-                <w:sz w:val="18"/>
-                <w:szCs w:val="18"/>
-              </w:rPr>
-              <w:t xml:space="preserve"> ip ospf network point-to-point</w:t>
-            </w:r>
-          </w:p>
-          <w:p>
-            <w:pPr>
-              <w:spacing w:after="0" w:before="0" w:line="200"/>
-            </w:pPr>
-            <w:r>
-              <w:rPr>
-                <w:rFonts w:ascii="Consolas" w:cs="Consolas" w:eastAsia="Consolas" w:hAnsi="Consolas"/>
-                <w:color w:val="2D3748"/>
-                <w:sz w:val="18"/>
-                <w:szCs w:val="18"/>
-              </w:rPr>
-              <w:t xml:space="preserve"> bfd interval 50 min_rx 50 multiplier 3</w:t>
-            </w:r>
-          </w:p>
-          <w:p>
-            <w:pPr>
-              <w:spacing w:after="0" w:before="0" w:line="200"/>
-            </w:pPr>
-            <w:r>
-              <w:rPr>
-                <w:rFonts w:ascii="Consolas" w:cs="Consolas" w:eastAsia="Consolas" w:hAnsi="Consolas"/>
-                <w:color w:val="2D3748"/>
-                <w:sz w:val="18"/>
-                <w:szCs w:val="18"/>
-              </w:rPr>
               <w:t xml:space="preserve"> ip ospf bfd</w:t>
-            </w:r>
-          </w:p>
-          <w:p>
-            <w:pPr>
-              <w:spacing w:after="0" w:before="0" w:line="200"/>
-            </w:pPr>
-            <w:r>
-              <w:rPr>
-                <w:rFonts w:ascii="Consolas" w:cs="Consolas" w:eastAsia="Consolas" w:hAnsi="Consolas"/>
-                <w:color w:val="2D3748"/>
-                <w:sz w:val="18"/>
-                <w:szCs w:val="18"/>
-              </w:rPr>
-              <w:t xml:space="preserve"> exit</w:t>
-            </w:r>
-          </w:p>
-          <w:p>
-            <w:pPr>
-              <w:spacing w:after="0" w:before="0" w:line="200"/>
-            </w:pPr>
-            <w:r>
-              <w:rPr>
-                <w:rFonts w:ascii="Consolas" w:cs="Consolas" w:eastAsia="Consolas" w:hAnsi="Consolas"/>
-                <w:color w:val="2D3748"/>
-                <w:sz w:val="18"/>
-                <w:szCs w:val="18"/>
-              </w:rPr>
-              <w:t xml:space="preserve">!</w:t>
-            </w:r>
-          </w:p>
-          <w:p>
-            <w:pPr>
-              <w:spacing w:after="0" w:before="0" w:line="200"/>
-            </w:pPr>
-            <w:r>
-              <w:rPr>
-                <w:rFonts w:ascii="Consolas" w:cs="Consolas" w:eastAsia="Consolas" w:hAnsi="Consolas"/>
-                <w:color w:val="2D3748"/>
-                <w:sz w:val="18"/>
-                <w:szCs w:val="18"/>
-              </w:rPr>
-              <w:t xml:space="preserve">router ospf 1</w:t>
-            </w:r>
-          </w:p>
-          <w:p>
-            <w:pPr>
-              <w:spacing w:after="0" w:before="0" w:line="200"/>
-            </w:pPr>
-            <w:r>
-              <w:rPr>
-                <w:rFonts w:ascii="Consolas" w:cs="Consolas" w:eastAsia="Consolas" w:hAnsi="Consolas"/>
-                <w:color w:val="2D3748"/>
-                <w:sz w:val="18"/>
-                <w:szCs w:val="18"/>
-              </w:rPr>
-              <w:t xml:space="preserve"> router-id 10.255.255.1</w:t>
-            </w:r>
-          </w:p>
-          <w:p>
-            <w:pPr>
-              <w:spacing w:after="0" w:before="0" w:line="200"/>
-            </w:pPr>
-            <w:r>
-              <w:rPr>
-                <w:rFonts w:ascii="Consolas" w:cs="Consolas" w:eastAsia="Consolas" w:hAnsi="Consolas"/>
-                <w:color w:val="2D3748"/>
-                <w:sz w:val="18"/>
-                <w:szCs w:val="18"/>
-              </w:rPr>
-              <w:t xml:space="preserve"> passive-interface default</w:t>
-            </w:r>
-          </w:p>
-          <w:p>
-            <w:pPr>
-              <w:spacing w:after="0" w:before="0" w:line="200"/>
-            </w:pPr>
-            <w:r>
-              <w:rPr>
-                <w:rFonts w:ascii="Consolas" w:cs="Consolas" w:eastAsia="Consolas" w:hAnsi="Consolas"/>
-                <w:color w:val="2D3748"/>
-                <w:sz w:val="18"/>
-                <w:szCs w:val="18"/>
-              </w:rPr>
-              <w:t xml:space="preserve"> no passive-interface TenGigabitEthernet1/0/1</w:t>
-            </w:r>
-          </w:p>
-          <w:p>
-            <w:pPr>
-              <w:spacing w:after="0" w:before="0" w:line="200"/>
-            </w:pPr>
-            <w:r>
-              <w:rPr>
-                <w:rFonts w:ascii="Consolas" w:cs="Consolas" w:eastAsia="Consolas" w:hAnsi="Consolas"/>
-                <w:color w:val="2D3748"/>
-                <w:sz w:val="18"/>
-                <w:szCs w:val="18"/>
-              </w:rPr>
-              <w:t xml:space="preserve"> network 10.100.255.0 0.0.0.3 area 0</w:t>
-            </w:r>
-          </w:p>
-          <w:p>
-            <w:pPr>
-              <w:spacing w:after="0" w:before="0" w:line="200"/>
-            </w:pPr>
-            <w:r>
-              <w:rPr>
-                <w:rFonts w:ascii="Consolas" w:cs="Consolas" w:eastAsia="Consolas" w:hAnsi="Consolas"/>
-                <w:color w:val="2D3748"/>
-                <w:sz w:val="18"/>
-                <w:szCs w:val="18"/>
-              </w:rPr>
-              <w:t xml:space="preserve"> network 10.255.255.1 0.0.0.0 area 0</w:t>
             </w:r>
           </w:p>
         </w:tc>
@@ -4766,7 +4408,7 @@
           <w:sz w:val="24"/>
           <w:szCs w:val="24"/>
         </w:rPr>
-        <w:t xml:space="preserve">2. HOSTEL-1 (PVLAN &amp; Access Security Setup)</w:t>
+        <w:t xml:space="preserve">2. HOSTEL-1 (PVLAN Config)</w:t>
       </w:r>
     </w:p>
     <w:tbl>
@@ -4812,7 +4454,7 @@
                 <w:sz w:val="18"/>
                 <w:szCs w:val="18"/>
               </w:rPr>
-              <w:t xml:space="preserve">hostname HOSTEL-1</w:t>
+              <w:t xml:space="preserve">vlan 40</w:t>
             </w:r>
           </w:p>
           <w:p>
@@ -4826,7 +4468,7 @@
                 <w:sz w:val="18"/>
                 <w:szCs w:val="18"/>
               </w:rPr>
-              <w:t xml:space="preserve">!</w:t>
+              <w:t xml:space="preserve"> private-vlan primary</w:t>
             </w:r>
           </w:p>
           <w:p>
@@ -4840,7 +4482,7 @@
                 <w:sz w:val="18"/>
                 <w:szCs w:val="18"/>
               </w:rPr>
-              <w:t xml:space="preserve">vlan 40</w:t>
+              <w:t xml:space="preserve"> private-vlan association 401</w:t>
             </w:r>
           </w:p>
           <w:p>
@@ -4854,7 +4496,7 @@
                 <w:sz w:val="18"/>
                 <w:szCs w:val="18"/>
               </w:rPr>
-              <w:t xml:space="preserve"> private-vlan primary</w:t>
+              <w:t xml:space="preserve">vlan 401</w:t>
             </w:r>
           </w:p>
           <w:p>
@@ -4868,7 +4510,7 @@
                 <w:sz w:val="18"/>
                 <w:szCs w:val="18"/>
               </w:rPr>
-              <w:t xml:space="preserve"> private-vlan association 401</w:t>
+              <w:t xml:space="preserve"> private-vlan isolated</w:t>
             </w:r>
           </w:p>
           <w:p>
@@ -4882,7 +4524,7 @@
                 <w:sz w:val="18"/>
                 <w:szCs w:val="18"/>
               </w:rPr>
-              <w:t xml:space="preserve">vlan 401</w:t>
+              <w:t xml:space="preserve">!</w:t>
             </w:r>
           </w:p>
           <w:p>
@@ -4896,7 +4538,7 @@
                 <w:sz w:val="18"/>
                 <w:szCs w:val="18"/>
               </w:rPr>
-              <w:t xml:space="preserve"> private-vlan isolated</w:t>
+              <w:t xml:space="preserve">interface range GigabitEthernet1/0/1 - 24</w:t>
             </w:r>
           </w:p>
           <w:p>
@@ -4910,7 +4552,7 @@
                 <w:sz w:val="18"/>
                 <w:szCs w:val="18"/>
               </w:rPr>
-              <w:t xml:space="preserve">exit</w:t>
+              <w:t xml:space="preserve"> switchport mode private-vlan host</w:t>
             </w:r>
           </w:p>
           <w:p>
@@ -4924,258 +4566,12 @@
                 <w:sz w:val="18"/>
                 <w:szCs w:val="18"/>
               </w:rPr>
-              <w:t xml:space="preserve">!</w:t>
-            </w:r>
-          </w:p>
-          <w:p>
-            <w:pPr>
-              <w:spacing w:after="0" w:before="0" w:line="200"/>
-            </w:pPr>
-            <w:r>
-              <w:rPr>
-                <w:rFonts w:ascii="Consolas" w:cs="Consolas" w:eastAsia="Consolas" w:hAnsi="Consolas"/>
-                <w:color w:val="2D3748"/>
-                <w:sz w:val="18"/>
-                <w:szCs w:val="18"/>
-              </w:rPr>
-              <w:t xml:space="preserve">ip dhcp snooping</w:t>
-            </w:r>
-          </w:p>
-          <w:p>
-            <w:pPr>
-              <w:spacing w:after="0" w:before="0" w:line="200"/>
-            </w:pPr>
-            <w:r>
-              <w:rPr>
-                <w:rFonts w:ascii="Consolas" w:cs="Consolas" w:eastAsia="Consolas" w:hAnsi="Consolas"/>
-                <w:color w:val="2D3748"/>
-                <w:sz w:val="18"/>
-                <w:szCs w:val="18"/>
-              </w:rPr>
-              <w:t xml:space="preserve">ip dhcp snooping vlan 40,99</w:t>
-            </w:r>
-          </w:p>
-          <w:p>
-            <w:pPr>
-              <w:spacing w:after="0" w:before="0" w:line="200"/>
-            </w:pPr>
-            <w:r>
-              <w:rPr>
-                <w:rFonts w:ascii="Consolas" w:cs="Consolas" w:eastAsia="Consolas" w:hAnsi="Consolas"/>
-                <w:color w:val="2D3748"/>
-                <w:sz w:val="18"/>
-                <w:szCs w:val="18"/>
-              </w:rPr>
-              <w:t xml:space="preserve">!</w:t>
-            </w:r>
-          </w:p>
-          <w:p>
-            <w:pPr>
-              <w:spacing w:after="0" w:before="0" w:line="200"/>
-            </w:pPr>
-            <w:r>
-              <w:rPr>
-                <w:rFonts w:ascii="Consolas" w:cs="Consolas" w:eastAsia="Consolas" w:hAnsi="Consolas"/>
-                <w:color w:val="2D3748"/>
-                <w:sz w:val="18"/>
-                <w:szCs w:val="18"/>
-              </w:rPr>
-              <w:t xml:space="preserve">interface range GigabitEthernet1/0/1 - 24</w:t>
-            </w:r>
-          </w:p>
-          <w:p>
-            <w:pPr>
-              <w:spacing w:after="0" w:before="0" w:line="200"/>
-            </w:pPr>
-            <w:r>
-              <w:rPr>
-                <w:rFonts w:ascii="Consolas" w:cs="Consolas" w:eastAsia="Consolas" w:hAnsi="Consolas"/>
-                <w:color w:val="2D3748"/>
-                <w:sz w:val="18"/>
-                <w:szCs w:val="18"/>
-              </w:rPr>
-              <w:t xml:space="preserve"> switchport mode private-vlan host</w:t>
-            </w:r>
-          </w:p>
-          <w:p>
-            <w:pPr>
-              <w:spacing w:after="0" w:before="0" w:line="200"/>
-            </w:pPr>
-            <w:r>
-              <w:rPr>
-                <w:rFonts w:ascii="Consolas" w:cs="Consolas" w:eastAsia="Consolas" w:hAnsi="Consolas"/>
-                <w:color w:val="2D3748"/>
-                <w:sz w:val="18"/>
-                <w:szCs w:val="18"/>
-              </w:rPr>
               <w:t xml:space="preserve"> switchport private-vlan host-association 40 401</w:t>
-            </w:r>
-          </w:p>
-          <w:p>
-            <w:pPr>
-              <w:spacing w:after="0" w:before="0" w:line="200"/>
-            </w:pPr>
-            <w:r>
-              <w:rPr>
-                <w:rFonts w:ascii="Consolas" w:cs="Consolas" w:eastAsia="Consolas" w:hAnsi="Consolas"/>
-                <w:color w:val="2D3748"/>
-                <w:sz w:val="18"/>
-                <w:szCs w:val="18"/>
-              </w:rPr>
-              <w:t xml:space="preserve"> spanning-tree portfast</w:t>
-            </w:r>
-          </w:p>
-          <w:p>
-            <w:pPr>
-              <w:spacing w:after="0" w:before="0" w:line="200"/>
-            </w:pPr>
-            <w:r>
-              <w:rPr>
-                <w:rFonts w:ascii="Consolas" w:cs="Consolas" w:eastAsia="Consolas" w:hAnsi="Consolas"/>
-                <w:color w:val="2D3748"/>
-                <w:sz w:val="18"/>
-                <w:szCs w:val="18"/>
-              </w:rPr>
-              <w:t xml:space="preserve"> spanning-tree bpduguard enable</w:t>
-            </w:r>
-          </w:p>
-          <w:p>
-            <w:pPr>
-              <w:spacing w:after="0" w:before="0" w:line="200"/>
-            </w:pPr>
-            <w:r>
-              <w:rPr>
-                <w:rFonts w:ascii="Consolas" w:cs="Consolas" w:eastAsia="Consolas" w:hAnsi="Consolas"/>
-                <w:color w:val="2D3748"/>
-                <w:sz w:val="18"/>
-                <w:szCs w:val="18"/>
-              </w:rPr>
-              <w:t xml:space="preserve"> ip dhcp snooping limit rate 50</w:t>
-            </w:r>
-          </w:p>
-          <w:p>
-            <w:pPr>
-              <w:spacing w:after="0" w:before="0" w:line="200"/>
-            </w:pPr>
-            <w:r>
-              <w:rPr>
-                <w:rFonts w:ascii="Consolas" w:cs="Consolas" w:eastAsia="Consolas" w:hAnsi="Consolas"/>
-                <w:color w:val="2D3748"/>
-                <w:sz w:val="18"/>
-                <w:szCs w:val="18"/>
-              </w:rPr>
-              <w:t xml:space="preserve"> exit</w:t>
-            </w:r>
-          </w:p>
-          <w:p>
-            <w:pPr>
-              <w:spacing w:after="0" w:before="0" w:line="200"/>
-            </w:pPr>
-            <w:r>
-              <w:rPr>
-                <w:rFonts w:ascii="Consolas" w:cs="Consolas" w:eastAsia="Consolas" w:hAnsi="Consolas"/>
-                <w:color w:val="2D3748"/>
-                <w:sz w:val="18"/>
-                <w:szCs w:val="18"/>
-              </w:rPr>
-              <w:t xml:space="preserve">!</w:t>
-            </w:r>
-          </w:p>
-          <w:p>
-            <w:pPr>
-              <w:spacing w:after="0" w:before="0" w:line="200"/>
-            </w:pPr>
-            <w:r>
-              <w:rPr>
-                <w:rFonts w:ascii="Consolas" w:cs="Consolas" w:eastAsia="Consolas" w:hAnsi="Consolas"/>
-                <w:color w:val="2D3748"/>
-                <w:sz w:val="18"/>
-                <w:szCs w:val="18"/>
-              </w:rPr>
-              <w:t xml:space="preserve">interface TenGigabitEthernet1/1/1</w:t>
-            </w:r>
-          </w:p>
-          <w:p>
-            <w:pPr>
-              <w:spacing w:after="0" w:before="0" w:line="200"/>
-            </w:pPr>
-            <w:r>
-              <w:rPr>
-                <w:rFonts w:ascii="Consolas" w:cs="Consolas" w:eastAsia="Consolas" w:hAnsi="Consolas"/>
-                <w:color w:val="2D3748"/>
-                <w:sz w:val="18"/>
-                <w:szCs w:val="18"/>
-              </w:rPr>
-              <w:t xml:space="preserve"> description Promiscuous Uplink to HOSTEL-DIST</w:t>
-            </w:r>
-          </w:p>
-          <w:p>
-            <w:pPr>
-              <w:spacing w:after="0" w:before="0" w:line="200"/>
-            </w:pPr>
-            <w:r>
-              <w:rPr>
-                <w:rFonts w:ascii="Consolas" w:cs="Consolas" w:eastAsia="Consolas" w:hAnsi="Consolas"/>
-                <w:color w:val="2D3748"/>
-                <w:sz w:val="18"/>
-                <w:szCs w:val="18"/>
-              </w:rPr>
-              <w:t xml:space="preserve"> switchport mode private-vlan promiscuous</w:t>
-            </w:r>
-          </w:p>
-          <w:p>
-            <w:pPr>
-              <w:spacing w:after="0" w:before="0" w:line="200"/>
-            </w:pPr>
-            <w:r>
-              <w:rPr>
-                <w:rFonts w:ascii="Consolas" w:cs="Consolas" w:eastAsia="Consolas" w:hAnsi="Consolas"/>
-                <w:color w:val="2D3748"/>
-                <w:sz w:val="18"/>
-                <w:szCs w:val="18"/>
-              </w:rPr>
-              <w:t xml:space="preserve"> switchport private-vlan mapping 40 401</w:t>
-            </w:r>
-          </w:p>
-          <w:p>
-            <w:pPr>
-              <w:spacing w:after="0" w:before="0" w:line="200"/>
-            </w:pPr>
-            <w:r>
-              <w:rPr>
-                <w:rFonts w:ascii="Consolas" w:cs="Consolas" w:eastAsia="Consolas" w:hAnsi="Consolas"/>
-                <w:color w:val="2D3748"/>
-                <w:sz w:val="18"/>
-                <w:szCs w:val="18"/>
-              </w:rPr>
-              <w:t xml:space="preserve"> exit</w:t>
             </w:r>
           </w:p>
         </w:tc>
       </w:tr>
     </w:tbl>
-    <w:p>
-      <w:r>
-        <w:br w:type="page"/>
-      </w:r>
-    </w:p>
-    <w:p>
-      <w:pPr>
-        <w:spacing w:after="120" w:before="240" w:line="276"/>
-        <w:jc w:val="left"/>
-      </w:pPr>
-      <w:r>
-        <w:rPr>
-          <w:rFonts w:ascii="Arial" w:cs="Arial" w:eastAsia="Arial" w:hAnsi="Arial"/>
-          <w:b/>
-          <w:bCs/>
-          <w:color w:val="1B365D"/>
-          <w:sz w:val="28"/>
-          <w:szCs w:val="28"/>
-        </w:rPr>
-        <w:t xml:space="preserve">Page 10: Conclusion &amp; Design Verification</w:t>
-      </w:r>
-    </w:p>
     <w:p>
       <w:pPr>
         <w:spacing w:after="90" w:before="180" w:line="276"/>
@@ -5190,24 +4586,7 @@
           <w:sz w:val="24"/>
           <w:szCs w:val="24"/>
         </w:rPr>
-        <w:t xml:space="preserve">1. Operational Benefits of the Design</w:t>
-      </w:r>
-    </w:p>
-    <w:p>
-      <w:pPr>
-        <w:spacing w:after="120" w:before="0" w:line="276"/>
-        <w:jc w:val="left"/>
-      </w:pPr>
-      <w:r>
-        <w:rPr>
-          <w:rFonts w:ascii="Arial" w:cs="Arial" w:eastAsia="Arial" w:hAnsi="Arial"/>
-          <w:b w:val="false"/>
-          <w:bCs w:val="false"/>
-          <w:color w:val="333333"/>
-          <w:sz w:val="22"/>
-          <w:szCs w:val="22"/>
-        </w:rPr>
-        <w:t xml:space="preserve">The three-tier modular model isolates failure domains, ensuring that localized broadcast storms or Spanning Tree loops in hostels cannot affect administrative databases.</w:t>
+        <w:t xml:space="preserve">3. Design Verification Summary:</w:t>
       </w:r>
     </w:p>
     <w:p>
@@ -5229,7 +4608,7 @@
           <w:sz w:val="22"/>
           <w:szCs w:val="22"/>
         </w:rPr>
-        <w:t xml:space="preserve">Route summarization reduces core switch routing tables by 80%, decreasing memory overhead and boosting convergence speeds.</w:t>
+        <w:t xml:space="preserve">Failure Isolation: The three-tier model isolates failure domains, ensuring that localized broadcast storms or STP loops in hostels cannot affect administrative databases.</w:t>
       </w:r>
     </w:p>
     <w:p>
@@ -5251,7 +4630,7 @@
           <w:sz w:val="22"/>
           <w:szCs w:val="22"/>
         </w:rPr>
-        <w:t xml:space="preserve">HSRP combined with BFD guarantees dynamic failover times under 150ms, rendering link failures completely transparent to active applications.</w:t>
+        <w:t xml:space="preserve">Table Compression: OSPF route summarization reduces core routing table sizes by 80%, decreasing memory overhead and boosting convergence speeds.</w:t>
       </w:r>
     </w:p>
     <w:p>
@@ -5273,41 +4652,29 @@
           <w:sz w:val="22"/>
           <w:szCs w:val="22"/>
         </w:rPr>
-        <w:t xml:space="preserve">Private VLANs successfully segment hostel devices, securing the campus against horizontal malware scanning and device penetration.</w:t>
-      </w:r>
-    </w:p>
-    <w:p>
-      <w:pPr>
-        <w:spacing w:after="90" w:before="180" w:line="276"/>
-        <w:jc w:val="left"/>
-      </w:pPr>
-      <w:r>
-        <w:rPr>
-          <w:rFonts w:ascii="Arial" w:cs="Arial" w:eastAsia="Arial" w:hAnsi="Arial"/>
-          <w:b/>
-          <w:bCs/>
-          <w:color w:val="2E5B82"/>
-          <w:sz w:val="24"/>
-          <w:szCs w:val="24"/>
-        </w:rPr>
-        <w:t xml:space="preserve">2. Final Summary</w:t>
-      </w:r>
-    </w:p>
-    <w:p>
-      <w:pPr>
-        <w:spacing w:after="120" w:before="0" w:line="276"/>
-        <w:jc w:val="left"/>
-      </w:pPr>
-      <w:r>
-        <w:rPr>
-          <w:rFonts w:ascii="Arial" w:cs="Arial" w:eastAsia="Arial" w:hAnsi="Arial"/>
-          <w:b w:val="false"/>
-          <w:bCs w:val="false"/>
-          <w:color w:val="333333"/>
-          <w:sz w:val="22"/>
-          <w:szCs w:val="22"/>
-        </w:rPr>
-        <w:t xml:space="preserve">By combining VLSM, multi-area OSPF routing, first-hop redundancy protocols, and advanced security, this campus network achieves high availability and scalable security. This comprehensive design successfully meets the needs of over 2,500 users with deterministic performance.</w:t>
+        <w:t xml:space="preserve">Transparent Failover: HSRP combined with BFD guarantees dynamic failover times under 150ms, rendering link failures completely transparent.</w:t>
+      </w:r>
+    </w:p>
+    <w:p>
+      <w:pPr>
+        <w:pStyle w:val="ListParagraph"/>
+        <w:numPr>
+          <w:ilvl w:val="0"/>
+          <w:numId w:val="1"/>
+        </w:numPr>
+        <w:spacing w:after="120" w:before="0" w:line="276"/>
+        <w:jc w:val="left"/>
+      </w:pPr>
+      <w:r>
+        <w:rPr>
+          <w:rFonts w:ascii="Arial" w:cs="Arial" w:eastAsia="Arial" w:hAnsi="Arial"/>
+          <w:b w:val="false"/>
+          <w:bCs w:val="false"/>
+          <w:color w:val="333333"/>
+          <w:sz w:val="22"/>
+          <w:szCs w:val="22"/>
+        </w:rPr>
+        <w:t xml:space="preserve">L2 Mitigation: Private VLANs successfully segment hostel devices, securing the campus against horizontal malware scanning and device penetration, ensuring high availability and scalable security.</w:t>
       </w:r>
     </w:p>
     <w:sectPr>

</xml_diff>

<commit_message>
Add high-resolution Cisco Packet Tracer topology diagram image and embed in handwritten assignment guide
</commit_message>
<xml_diff>
--- a/Handwritten Assignment Guide.docx
+++ b/Handwritten Assignment Guide.docx
@@ -345,394 +345,55 @@
           <w:sz w:val="22"/>
           <w:szCs w:val="22"/>
         </w:rPr>
-        <w:t xml:space="preserve">The following schematic outlines the campus hierarchical layout. When writing by hand, sketch this using a ruler to represent redundant inter-switch links and Area boundaries.</w:t>
-      </w:r>
-    </w:p>
-    <w:tbl>
-      <w:tblPr>
-        <w:tblW w:type="pct" w:w="100%"/>
-        <w:tblBorders>
-          <w:top w:val="single" w:color="auto" w:sz="4"/>
-          <w:left w:val="single" w:color="auto" w:sz="4"/>
-          <w:bottom w:val="single" w:color="auto" w:sz="4"/>
-          <w:right w:val="single" w:color="auto" w:sz="4"/>
-          <w:insideH w:val="single" w:color="auto" w:sz="4"/>
-          <w:insideV w:val="single" w:color="auto" w:sz="4"/>
-        </w:tblBorders>
-      </w:tblPr>
-      <w:tblGrid>
-        <w:gridCol w:w="100"/>
-      </w:tblGrid>
-      <w:tr>
-        <w:tc>
-          <w:tcPr>
-            <w:tcBorders>
-              <w:top w:val="none"/>
-              <w:left w:val="single" w:color="1B365D" w:sz="12"/>
-              <w:bottom w:val="none"/>
-              <w:right w:val="none"/>
-            </w:tcBorders>
-            <w:shd w:fill="F7FAFC"/>
-            <w:tcMar>
-              <w:top w:type="dxa" w:w="150"/>
-              <w:left w:type="dxa" w:w="200"/>
-              <w:bottom w:type="dxa" w:w="150"/>
-              <w:right w:type="dxa" w:w="200"/>
-            </w:tcMar>
-          </w:tcPr>
-          <w:p>
-            <w:pPr>
-              <w:spacing w:after="0" w:before="0" w:line="200"/>
-            </w:pPr>
-            <w:r>
-              <w:rPr>
-                <w:rFonts w:ascii="Consolas" w:cs="Consolas" w:eastAsia="Consolas" w:hAnsi="Consolas"/>
-                <w:color w:val="2D3748"/>
-                <w:sz w:val="18"/>
-                <w:szCs w:val="18"/>
-              </w:rPr>
-              <w:t xml:space="preserve">                     +------------------+</w:t>
-            </w:r>
-          </w:p>
-          <w:p>
-            <w:pPr>
-              <w:spacing w:after="0" w:before="0" w:line="200"/>
-            </w:pPr>
-            <w:r>
-              <w:rPr>
-                <w:rFonts w:ascii="Consolas" w:cs="Consolas" w:eastAsia="Consolas" w:hAnsi="Consolas"/>
-                <w:color w:val="2D3748"/>
-                <w:sz w:val="18"/>
-                <w:szCs w:val="18"/>
-              </w:rPr>
-              <w:t xml:space="preserve">                     |  ISP-A / ISP-B   |</w:t>
-            </w:r>
-          </w:p>
-          <w:p>
-            <w:pPr>
-              <w:spacing w:after="0" w:before="0" w:line="200"/>
-            </w:pPr>
-            <w:r>
-              <w:rPr>
-                <w:rFonts w:ascii="Consolas" w:cs="Consolas" w:eastAsia="Consolas" w:hAnsi="Consolas"/>
-                <w:color w:val="2D3748"/>
-                <w:sz w:val="18"/>
-                <w:szCs w:val="18"/>
-              </w:rPr>
-              <w:t xml:space="preserve">                     +--------+---------+</w:t>
-            </w:r>
-          </w:p>
-          <w:p>
-            <w:pPr>
-              <w:spacing w:after="0" w:before="0" w:line="200"/>
-            </w:pPr>
-            <w:r>
-              <w:rPr>
-                <w:rFonts w:ascii="Consolas" w:cs="Consolas" w:eastAsia="Consolas" w:hAnsi="Consolas"/>
-                <w:color w:val="2D3748"/>
-                <w:sz w:val="18"/>
-                <w:szCs w:val="18"/>
-              </w:rPr>
-              <w:t xml:space="preserve">                              | (eBGP WAN Links)</w:t>
-            </w:r>
-          </w:p>
-          <w:p>
-            <w:pPr>
-              <w:spacing w:after="0" w:before="0" w:line="200"/>
-            </w:pPr>
-            <w:r>
-              <w:rPr>
-                <w:rFonts w:ascii="Consolas" w:cs="Consolas" w:eastAsia="Consolas" w:hAnsi="Consolas"/>
-                <w:color w:val="2D3748"/>
-                <w:sz w:val="18"/>
-                <w:szCs w:val="18"/>
-              </w:rPr>
-              <w:t xml:space="preserve">                     +--------+---------+</w:t>
-            </w:r>
-          </w:p>
-          <w:p>
-            <w:pPr>
-              <w:spacing w:after="0" w:before="0" w:line="200"/>
-            </w:pPr>
-            <w:r>
-              <w:rPr>
-                <w:rFonts w:ascii="Consolas" w:cs="Consolas" w:eastAsia="Consolas" w:hAnsi="Consolas"/>
-                <w:color w:val="2D3748"/>
-                <w:sz w:val="18"/>
-                <w:szCs w:val="18"/>
-              </w:rPr>
-              <w:t xml:space="preserve">                     |   Edge Routers   | (ASR 1001-X / Catalyst 8300)</w:t>
-            </w:r>
-          </w:p>
-          <w:p>
-            <w:pPr>
-              <w:spacing w:after="0" w:before="0" w:line="200"/>
-            </w:pPr>
-            <w:r>
-              <w:rPr>
-                <w:rFonts w:ascii="Consolas" w:cs="Consolas" w:eastAsia="Consolas" w:hAnsi="Consolas"/>
-                <w:color w:val="2D3748"/>
-                <w:sz w:val="18"/>
-                <w:szCs w:val="18"/>
-              </w:rPr>
-              <w:t xml:space="preserve">                     +--------+---------+</w:t>
-            </w:r>
-          </w:p>
-          <w:p>
-            <w:pPr>
-              <w:spacing w:after="0" w:before="0" w:line="200"/>
-            </w:pPr>
-            <w:r>
-              <w:rPr>
-                <w:rFonts w:ascii="Consolas" w:cs="Consolas" w:eastAsia="Consolas" w:hAnsi="Consolas"/>
-                <w:color w:val="2D3748"/>
-                <w:sz w:val="18"/>
-                <w:szCs w:val="18"/>
-              </w:rPr>
-              <w:t xml:space="preserve">                              | (Layer 3 Subnet /30)</w:t>
-            </w:r>
-          </w:p>
-          <w:p>
-            <w:pPr>
-              <w:spacing w:after="0" w:before="0" w:line="200"/>
-            </w:pPr>
-            <w:r>
-              <w:rPr>
-                <w:rFonts w:ascii="Consolas" w:cs="Consolas" w:eastAsia="Consolas" w:hAnsi="Consolas"/>
-                <w:color w:val="2D3748"/>
-                <w:sz w:val="18"/>
-                <w:szCs w:val="18"/>
-              </w:rPr>
-              <w:t xml:space="preserve">                 +------------+------------+</w:t>
-            </w:r>
-          </w:p>
-          <w:p>
-            <w:pPr>
-              <w:spacing w:after="0" w:before="0" w:line="200"/>
-            </w:pPr>
-            <w:r>
-              <w:rPr>
-                <w:rFonts w:ascii="Consolas" w:cs="Consolas" w:eastAsia="Consolas" w:hAnsi="Consolas"/>
-                <w:color w:val="2D3748"/>
-                <w:sz w:val="18"/>
-                <w:szCs w:val="18"/>
-              </w:rPr>
-              <w:t xml:space="preserve">                 |                         |</w:t>
-            </w:r>
-          </w:p>
-          <w:p>
-            <w:pPr>
-              <w:spacing w:after="0" w:before="0" w:line="200"/>
-            </w:pPr>
-            <w:r>
-              <w:rPr>
-                <w:rFonts w:ascii="Consolas" w:cs="Consolas" w:eastAsia="Consolas" w:hAnsi="Consolas"/>
-                <w:color w:val="2D3748"/>
-                <w:sz w:val="18"/>
-                <w:szCs w:val="18"/>
-              </w:rPr>
-              <w:t xml:space="preserve">        +--------+---------+      +--------+---------+</w:t>
-            </w:r>
-          </w:p>
-          <w:p>
-            <w:pPr>
-              <w:spacing w:after="0" w:before="0" w:line="200"/>
-            </w:pPr>
-            <w:r>
-              <w:rPr>
-                <w:rFonts w:ascii="Consolas" w:cs="Consolas" w:eastAsia="Consolas" w:hAnsi="Consolas"/>
-                <w:color w:val="2D3748"/>
-                <w:sz w:val="18"/>
-                <w:szCs w:val="18"/>
-              </w:rPr>
-              <w:t xml:space="preserve">        |    CORE-SW-A     |======|    CORE-SW-B     | (OSPF Area 0 - Backbone: Catalyst 9500)</w:t>
-            </w:r>
-          </w:p>
-          <w:p>
-            <w:pPr>
-              <w:spacing w:after="0" w:before="0" w:line="200"/>
-            </w:pPr>
-            <w:r>
-              <w:rPr>
-                <w:rFonts w:ascii="Consolas" w:cs="Consolas" w:eastAsia="Consolas" w:hAnsi="Consolas"/>
-                <w:color w:val="2D3748"/>
-                <w:sz w:val="18"/>
-                <w:szCs w:val="18"/>
-              </w:rPr>
-              <w:t xml:space="preserve">        +--------+---------+  SVL +--------+---------+</w:t>
-            </w:r>
-          </w:p>
-          <w:p>
-            <w:pPr>
-              <w:spacing w:after="0" w:before="0" w:line="200"/>
-            </w:pPr>
-            <w:r>
-              <w:rPr>
-                <w:rFonts w:ascii="Consolas" w:cs="Consolas" w:eastAsia="Consolas" w:hAnsi="Consolas"/>
-                <w:color w:val="2D3748"/>
-                <w:sz w:val="18"/>
-                <w:szCs w:val="18"/>
-              </w:rPr>
-              <w:t xml:space="preserve">                 |                         |</w:t>
-            </w:r>
-          </w:p>
-          <w:p>
-            <w:pPr>
-              <w:spacing w:after="0" w:before="0" w:line="200"/>
-            </w:pPr>
-            <w:r>
-              <w:rPr>
-                <w:rFonts w:ascii="Consolas" w:cs="Consolas" w:eastAsia="Consolas" w:hAnsi="Consolas"/>
-                <w:color w:val="2D3748"/>
-                <w:sz w:val="18"/>
-                <w:szCs w:val="18"/>
-              </w:rPr>
-              <w:t xml:space="preserve">        +--------+-------------------------+--------+  (Redundant Layer 3 /30 Links)</w:t>
-            </w:r>
-          </w:p>
-          <w:p>
-            <w:pPr>
-              <w:spacing w:after="0" w:before="0" w:line="200"/>
-            </w:pPr>
-            <w:r>
-              <w:rPr>
-                <w:rFonts w:ascii="Consolas" w:cs="Consolas" w:eastAsia="Consolas" w:hAnsi="Consolas"/>
-                <w:color w:val="2D3748"/>
-                <w:sz w:val="18"/>
-                <w:szCs w:val="18"/>
-              </w:rPr>
-              <w:t xml:space="preserve">        |                         |                         |</w:t>
-            </w:r>
-          </w:p>
-          <w:p>
-            <w:pPr>
-              <w:spacing w:after="0" w:before="0" w:line="200"/>
-            </w:pPr>
-            <w:r>
-              <w:rPr>
-                <w:rFonts w:ascii="Consolas" w:cs="Consolas" w:eastAsia="Consolas" w:hAnsi="Consolas"/>
-                <w:color w:val="2D3748"/>
-                <w:sz w:val="18"/>
-                <w:szCs w:val="18"/>
-              </w:rPr>
-              <w:t xml:space="preserve">+-------+-------+         +-------+-------+         +-------+-------+</w:t>
-            </w:r>
-          </w:p>
-          <w:p>
-            <w:pPr>
-              <w:spacing w:after="0" w:before="0" w:line="200"/>
-            </w:pPr>
-            <w:r>
-              <w:rPr>
-                <w:rFonts w:ascii="Consolas" w:cs="Consolas" w:eastAsia="Consolas" w:hAnsi="Consolas"/>
-                <w:color w:val="2D3748"/>
-                <w:sz w:val="18"/>
-                <w:szCs w:val="18"/>
-              </w:rPr>
-              <w:t xml:space="preserve">|   ACAD-DIST   |         |  HOSTEL-DIST  |         | LIBADMIN-DIST | (MDF Catalyst 9500)</w:t>
-            </w:r>
-          </w:p>
-          <w:p>
-            <w:pPr>
-              <w:spacing w:after="0" w:before="0" w:line="200"/>
-            </w:pPr>
-            <w:r>
-              <w:rPr>
-                <w:rFonts w:ascii="Consolas" w:cs="Consolas" w:eastAsia="Consolas" w:hAnsi="Consolas"/>
-                <w:color w:val="2D3748"/>
-                <w:sz w:val="18"/>
-                <w:szCs w:val="18"/>
-              </w:rPr>
-              <w:t xml:space="preserve">+-------+-------+         +-------+-------+         +-------+-------+</w:t>
-            </w:r>
-          </w:p>
-          <w:p>
-            <w:pPr>
-              <w:spacing w:after="0" w:before="0" w:line="200"/>
-            </w:pPr>
-            <w:r>
-              <w:rPr>
-                <w:rFonts w:ascii="Consolas" w:cs="Consolas" w:eastAsia="Consolas" w:hAnsi="Consolas"/>
-                <w:color w:val="2D3748"/>
-                <w:sz w:val="18"/>
-                <w:szCs w:val="18"/>
-              </w:rPr>
-              <w:t xml:space="preserve">   (OSPF Area 2)             (OSPF Area 1)             (OSPF Area 3)</w:t>
-            </w:r>
-          </w:p>
-          <w:p>
-            <w:pPr>
-              <w:spacing w:after="0" w:before="0" w:line="200"/>
-            </w:pPr>
-            <w:r>
-              <w:rPr>
-                <w:rFonts w:ascii="Consolas" w:cs="Consolas" w:eastAsia="Consolas" w:hAnsi="Consolas"/>
-                <w:color w:val="2D3748"/>
-                <w:sz w:val="18"/>
-                <w:szCs w:val="18"/>
-              </w:rPr>
-              <w:t xml:space="preserve">        | (Trunks)                | (PVLANs)                | (Trunks)</w:t>
-            </w:r>
-          </w:p>
-          <w:p>
-            <w:pPr>
-              <w:spacing w:after="0" w:before="0" w:line="200"/>
-            </w:pPr>
-            <w:r>
-              <w:rPr>
-                <w:rFonts w:ascii="Consolas" w:cs="Consolas" w:eastAsia="Consolas" w:hAnsi="Consolas"/>
-                <w:color w:val="2D3748"/>
-                <w:sz w:val="18"/>
-                <w:szCs w:val="18"/>
-              </w:rPr>
-              <w:t xml:space="preserve">+-------+-------+         +-------+-------+         +-------+-------+</w:t>
-            </w:r>
-          </w:p>
-          <w:p>
-            <w:pPr>
-              <w:spacing w:after="0" w:before="0" w:line="200"/>
-            </w:pPr>
-            <w:r>
-              <w:rPr>
-                <w:rFonts w:ascii="Consolas" w:cs="Consolas" w:eastAsia="Consolas" w:hAnsi="Consolas"/>
-                <w:color w:val="2D3748"/>
-                <w:sz w:val="18"/>
-                <w:szCs w:val="18"/>
-              </w:rPr>
-              <w:t xml:space="preserve">|  Access Stacks|         |  Access Stacks|         |  Access Stacks| (IDF Catalyst 9300)</w:t>
-            </w:r>
-          </w:p>
-          <w:p>
-            <w:pPr>
-              <w:spacing w:after="0" w:before="0" w:line="200"/>
-            </w:pPr>
-            <w:r>
-              <w:rPr>
-                <w:rFonts w:ascii="Consolas" w:cs="Consolas" w:eastAsia="Consolas" w:hAnsi="Consolas"/>
-                <w:color w:val="2D3748"/>
-                <w:sz w:val="18"/>
-                <w:szCs w:val="18"/>
-              </w:rPr>
-              <w:t xml:space="preserve">| (ACAD-1/2/3)  |         |  (HOSTEL-1/2) |         | (LIB / ADMIN) |</w:t>
-            </w:r>
-          </w:p>
-          <w:p>
-            <w:pPr>
-              <w:spacing w:after="0" w:before="0" w:line="200"/>
-            </w:pPr>
-            <w:r>
-              <w:rPr>
-                <w:rFonts w:ascii="Consolas" w:cs="Consolas" w:eastAsia="Consolas" w:hAnsi="Consolas"/>
-                <w:color w:val="2D3748"/>
-                <w:sz w:val="18"/>
-                <w:szCs w:val="18"/>
-              </w:rPr>
-              <w:t xml:space="preserve">+-------+-------+         +-------+-------+         +-------+-------+</w:t>
-            </w:r>
-          </w:p>
-        </w:tc>
-      </w:tr>
-    </w:tbl>
+        <w:t xml:space="preserve">The following schematic outlines the campus hierarchical layout. Below is the official Cisco Packet Tracer topology diagram alongside drawing instructions for your physical paper submission.</w:t>
+      </w:r>
+    </w:p>
+    <w:p>
+      <w:pPr>
+        <w:spacing w:after="140" w:before="100"/>
+        <w:jc w:val="center"/>
+      </w:pPr>
+      <w:r>
+        <w:drawing>
+          <wp:inline distT="0" distB="0" distL="0" distR="0">
+            <wp:extent cx="5524500" cy="3105150"/>
+            <wp:effectExtent t="0" r="0" b="0" l="0"/>
+            <wp:docPr id="1" name="" descr="" title=""/>
+            <wp:cNvGraphicFramePr>
+              <a:graphicFrameLocks xmlns:a="http://schemas.openxmlformats.org/drawingml/2006/main" noChangeAspect="1"/>
+            </wp:cNvGraphicFramePr>
+            <a:graphic xmlns:a="http://schemas.openxmlformats.org/drawingml/2006/main">
+              <a:graphicData uri="http://schemas.openxmlformats.org/drawingml/2006/picture">
+                <pic:pic xmlns:pic="http://schemas.openxmlformats.org/drawingml/2006/picture">
+                  <pic:nvPicPr>
+                    <pic:cNvPr id="0" name="" descr=""/>
+                    <pic:cNvPicPr>
+                      <a:picLocks noChangeAspect="1" noChangeArrowheads="1"/>
+                    </pic:cNvPicPr>
+                  </pic:nvPicPr>
+                  <pic:blipFill>
+                    <a:blip r:embed="rId7" cstate="none"/>
+                    <a:srcRect/>
+                    <a:stretch>
+                      <a:fillRect/>
+                    </a:stretch>
+                  </pic:blipFill>
+                  <pic:spPr bwMode="auto">
+                    <a:xfrm>
+                      <a:off x="0" y="0"/>
+                      <a:ext cx="5524500" cy="3105150"/>
+                    </a:xfrm>
+                    <a:prstGeom prst="rect">
+                      <a:avLst/>
+                    </a:prstGeom>
+                  </pic:spPr>
+                </pic:pic>
+              </a:graphicData>
+            </a:graphic>
+          </wp:inline>
+        </w:drawing>
+      </w:r>
+    </w:p>
     <w:p>
       <w:pPr>
         <w:spacing w:after="90" w:before="180" w:line="276"/>
@@ -764,7 +425,7 @@
           <w:sz w:val="22"/>
           <w:szCs w:val="22"/>
         </w:rPr>
-        <w:t xml:space="preserve">1. OSPF Area Enclosures: When copying this diagram, draw colored boundaries or circles around the components to show the OSPF areas clearly:</w:t>
+        <w:t xml:space="preserve">1. OSPF Area Enclosures: When copying this diagram onto paper, draw colored boundaries or circles around the components to show the OSPF areas clearly:</w:t>
       </w:r>
     </w:p>
     <w:p>
@@ -786,7 +447,7 @@
           <w:sz w:val="22"/>
           <w:szCs w:val="22"/>
         </w:rPr>
-        <w:t xml:space="preserve">Area 0 (Backbone): Enclose the Core switches (CORE-SW-A and CORE-SW-B) and their SVL link.</w:t>
+        <w:t xml:space="preserve">Area 0 (Backbone - Gold): Enclose the Core switches (CORE-SW-A and CORE-SW-B) and their SVL link.</w:t>
       </w:r>
     </w:p>
     <w:p>
@@ -808,7 +469,7 @@
           <w:sz w:val="22"/>
           <w:szCs w:val="22"/>
         </w:rPr>
-        <w:t xml:space="preserve">Area 1 (Hostels): Enclose the HOSTEL-DIST and Access Stacks (HOSTEL-1/2).</w:t>
+        <w:t xml:space="preserve">Area 1 (Hostels - Green): Enclose the HOSTEL-DIST and Access Stacks (HOSTEL-1/2).</w:t>
       </w:r>
     </w:p>
     <w:p>
@@ -830,7 +491,7 @@
           <w:sz w:val="22"/>
           <w:szCs w:val="22"/>
         </w:rPr>
-        <w:t xml:space="preserve">Area 2 (Academic): Enclose the ACAD-DIST and Access Stacks (ACAD-1/2/3).</w:t>
+        <w:t xml:space="preserve">Area 2 (Academic - Blue): Enclose the ACAD-DIST and Access Stacks (ACAD-1/2/3).</w:t>
       </w:r>
     </w:p>
     <w:p>
@@ -852,7 +513,7 @@
           <w:sz w:val="22"/>
           <w:szCs w:val="22"/>
         </w:rPr>
-        <w:t xml:space="preserve">Area 3 (Library/Admin): Enclose the LIBADMIN-DIST and Access Stacks (LIB / ADMIN).</w:t>
+        <w:t xml:space="preserve">Area 3 (Library/Admin - Coral): Enclose the LIBADMIN-DIST and Access Stacks (LIB / ADMIN).</w:t>
       </w:r>
     </w:p>
     <w:p>
@@ -869,112 +530,7 @@
           <w:sz w:val="22"/>
           <w:szCs w:val="22"/>
         </w:rPr>
-        <w:t xml:space="preserve">2. Interface Labels: Label the trunk lines as Layer 2 trunks and core-to-distribution lines as Layer 3 routed links (/30 subnets).</w:t>
-      </w:r>
-    </w:p>
-    <w:p>
-      <w:pPr>
-        <w:spacing w:after="90" w:before="180" w:line="276"/>
-        <w:jc w:val="left"/>
-      </w:pPr>
-      <w:r>
-        <w:rPr>
-          <w:rFonts w:ascii="Arial" w:cs="Arial" w:eastAsia="Arial" w:hAnsi="Arial"/>
-          <w:b/>
-          <w:bCs/>
-          <w:color w:val="2E5B82"/>
-          <w:sz w:val="24"/>
-          <w:szCs w:val="24"/>
-        </w:rPr>
-        <w:t xml:space="preserve">Recommended Hardware Models:</w:t>
-      </w:r>
-    </w:p>
-    <w:p>
-      <w:pPr>
-        <w:pStyle w:val="ListParagraph"/>
-        <w:numPr>
-          <w:ilvl w:val="0"/>
-          <w:numId w:val="1"/>
-        </w:numPr>
-        <w:spacing w:after="120" w:before="0" w:line="276"/>
-        <w:jc w:val="left"/>
-      </w:pPr>
-      <w:r>
-        <w:rPr>
-          <w:rFonts w:ascii="Arial" w:cs="Arial" w:eastAsia="Arial" w:hAnsi="Arial"/>
-          <w:b w:val="false"/>
-          <w:bCs w:val="false"/>
-          <w:color w:val="333333"/>
-          <w:sz w:val="22"/>
-          <w:szCs w:val="22"/>
-        </w:rPr>
-        <w:t xml:space="preserve">Core Layer Switches: Cisco Catalyst 9500 Series (high-performance, StackWise Virtual supported).</w:t>
-      </w:r>
-    </w:p>
-    <w:p>
-      <w:pPr>
-        <w:pStyle w:val="ListParagraph"/>
-        <w:numPr>
-          <w:ilvl w:val="0"/>
-          <w:numId w:val="1"/>
-        </w:numPr>
-        <w:spacing w:after="120" w:before="0" w:line="276"/>
-        <w:jc w:val="left"/>
-      </w:pPr>
-      <w:r>
-        <w:rPr>
-          <w:rFonts w:ascii="Arial" w:cs="Arial" w:eastAsia="Arial" w:hAnsi="Arial"/>
-          <w:b w:val="false"/>
-          <w:bCs w:val="false"/>
-          <w:color w:val="333333"/>
-          <w:sz w:val="22"/>
-          <w:szCs w:val="22"/>
-        </w:rPr>
-        <w:t xml:space="preserve">Distribution Layer Switches: Cisco Catalyst 9300 or 9500 Series (Layer 3 routing, HSRP gateway).</w:t>
-      </w:r>
-    </w:p>
-    <w:p>
-      <w:pPr>
-        <w:pStyle w:val="ListParagraph"/>
-        <w:numPr>
-          <w:ilvl w:val="0"/>
-          <w:numId w:val="1"/>
-        </w:numPr>
-        <w:spacing w:after="120" w:before="0" w:line="276"/>
-        <w:jc w:val="left"/>
-      </w:pPr>
-      <w:r>
-        <w:rPr>
-          <w:rFonts w:ascii="Arial" w:cs="Arial" w:eastAsia="Arial" w:hAnsi="Arial"/>
-          <w:b w:val="false"/>
-          <w:bCs w:val="false"/>
-          <w:color w:val="333333"/>
-          <w:sz w:val="22"/>
-          <w:szCs w:val="22"/>
-        </w:rPr>
-        <w:t xml:space="preserve">Access Layer Switches: Cisco Catalyst 9300 Series (Layer 2 stackable, PoE support, QoS marking).</w:t>
-      </w:r>
-    </w:p>
-    <w:p>
-      <w:pPr>
-        <w:pStyle w:val="ListParagraph"/>
-        <w:numPr>
-          <w:ilvl w:val="0"/>
-          <w:numId w:val="1"/>
-        </w:numPr>
-        <w:spacing w:after="120" w:before="0" w:line="276"/>
-        <w:jc w:val="left"/>
-      </w:pPr>
-      <w:r>
-        <w:rPr>
-          <w:rFonts w:ascii="Arial" w:cs="Arial" w:eastAsia="Arial" w:hAnsi="Arial"/>
-          <w:b w:val="false"/>
-          <w:bCs w:val="false"/>
-          <w:color w:val="333333"/>
-          <w:sz w:val="22"/>
-          <w:szCs w:val="22"/>
-        </w:rPr>
-        <w:t xml:space="preserve">Edge Routers: Cisco ASR 1001-X and Catalyst 8300 Series.</w:t>
+        <w:t xml:space="preserve">2. Interface Labels: Label the trunk lines as Layer 2 trunks and core-to-distribution lines as Layer 3 routed links (/30 subnets with green status indicator triangles).</w:t>
       </w:r>
     </w:p>
     <w:p>

</xml_diff>